<commit_message>
Proposal Tarakan: Lampiran 4 dengan 29 tangkapan layar terbaru per lapisan superapp
Tangkapan layar lama (5 gambar, dipakai proposal Kaltara dan tidak diubah)
memuat cacat: riwayat alur kosong, pengaju kosong, sorotan hari ini 0 agenda
padahal ada agenda, dan format tanggal Amerika. Banyak fitur yang diklaim
naskah juga tidak bergambar.

Kini diambil ulang dari aplikasi versi terbaru dengan data contoh rekaan dan
peladen tiruan (docs/lomba/build/tangkapan/), dikelompokkan menurut lapisan
superapp: Pimpinan/ajudan/mitra, pejabat struktural (daftar periksa, jejak
audit, usulan perubahan, PLH), petugas (penugasan, rekap kinerja, E-Kinerja,
evaluasi), komunikasi dan dokumentasi, layanan publik (audiensi, peminjaman
ruangan, daftar hadir), serta administrasi dan integrasi (generator
undangan + Imbaya, Google Calendar, rekap WA, laporan).

Co-Authored-By: Claude Opus 5.5 <noreply@anthropic.com>
Claude-Session: https://claude.ai/code/session_01TchDZWsQsgeuq52sKmozd1
</commit_message>
<xml_diff>
--- a/docs/lomba/tarakan/Proposal-Tarakan-Prokopim-Hibot.docx
+++ b/docs/lomba/tarakan/Proposal-Tarakan-Prokopim-Hibot.docx
@@ -764,7 +764,7 @@
           <w:sz w:val="20"/>
           <w:szCs w:val="20"/>
         </w:rPr>
-        <w:t xml:space="preserve">7.1 Penjaringan Ide	10</w:t>
+        <w:t xml:space="preserve">7.1 Penjaringan Ide	11</w:t>
       </w:r>
     </w:p>
     <w:p>
@@ -821,7 +821,7 @@
           <w:sz w:val="20"/>
           <w:szCs w:val="20"/>
         </w:rPr>
-        <w:t xml:space="preserve">7.4 SOP, Keputusan Pendukung, dan Dokumentasi	11</w:t>
+        <w:t xml:space="preserve">7.4 SOP, Keputusan Pendukung, dan Dokumentasi	12</w:t>
       </w:r>
     </w:p>
     <w:p>
@@ -897,7 +897,7 @@
           <w:sz w:val="20"/>
           <w:szCs w:val="20"/>
         </w:rPr>
-        <w:t xml:space="preserve">8.3 Anggaran, Teknologi, Sarana, dan Efisiensi	12</w:t>
+        <w:t xml:space="preserve">8.3 Anggaran, Teknologi, Sarana, dan Efisiensi	13</w:t>
       </w:r>
     </w:p>
     <w:p>
@@ -954,7 +954,7 @@
           <w:sz w:val="20"/>
           <w:szCs w:val="20"/>
         </w:rPr>
-        <w:t xml:space="preserve">9.2 Pertumbuhan Penggunaan	13</w:t>
+        <w:t xml:space="preserve">9.2 Pertumbuhan Penggunaan	14</w:t>
       </w:r>
     </w:p>
     <w:p>
@@ -1011,7 +1011,7 @@
           <w:sz w:val="20"/>
           <w:szCs w:val="20"/>
         </w:rPr>
-        <w:t xml:space="preserve">9.5 Jangkauan Layanan Publik	14</w:t>
+        <w:t xml:space="preserve">9.5 Jangkauan Layanan Publik	15</w:t>
       </w:r>
     </w:p>
     <w:p>
@@ -6080,7 +6080,7 @@
           <w:sz w:val="22"/>
           <w:szCs w:val="22"/>
         </w:rPr>
-        <w:t xml:space="preserve">, grup percakapan, dan aplikasi lain: setiap peran membuka aplikasi yang sama dan langsung melihat layanan yang menjadi haknya, sebagaimana Tabel 6.</w:t>
+        <w:t xml:space="preserve">, grup percakapan, dan aplikasi lain: setiap peran membuka aplikasi yang sama dan langsung melihat layanan yang menjadi haknya, sebagaimana Tabel 6. Tangkapan layar setiap lapisan disertakan pada Lampiran 4.</w:t>
       </w:r>
     </w:p>
     <w:p>
@@ -21116,9 +21116,294 @@
           <w:sz w:val="20"/>
           <w:szCs w:val="20"/>
         </w:rPr>
-        <w:t xml:space="preserve">Tangkapan layar diambil dari aplikasi Prokopim Hibot yang dijalankan dengan data contoh, untuk menghindari penyebaran nomor telepon narahubung dan agenda Pimpinan yang belum terbuka untuk umum. Seluruh tampilan dan alurnya sama dengan sistem yang berjalan.</w:t>
-      </w:r>
-    </w:p>
+        <w:t xml:space="preserve">Tangkapan layar diambil dari aplikasi Prokopim Hibot versi terbaru yang dijalankan dengan data contoh, untuk menghindari penyebaran nomor telepon narahubung, data pemohon, dan agenda Pimpinan yang belum terbuka untuk umum. Seluruh tampilan, menu, dan alurnya sama dengan sistem yang berjalan. Gambar dikelompokkan menurut lapisan layanan superapp pada Tabel 6.</w:t>
+      </w:r>
+    </w:p>
+    <w:p>
+      <w:pPr>
+        <w:keepNext/>
+        <w:spacing w:after="120" w:before="120"/>
+      </w:pPr>
+      <w:r>
+        <w:rPr>
+          <w:rFonts w:ascii="Arial" w:cs="Arial" w:eastAsia="Arial" w:hAnsi="Arial"/>
+          <w:b/>
+          <w:bCs/>
+          <w:sz w:val="22"/>
+          <w:szCs w:val="22"/>
+        </w:rPr>
+        <w:t xml:space="preserve">A. Pimpinan Daerah, Ajudan, dan Mitra Kerja</w:t>
+      </w:r>
+    </w:p>
+    <w:tbl>
+      <w:tblPr>
+        <w:tblW w:type="dxa" w:w="8787"/>
+        <w:tblBorders>
+          <w:top w:val="single" w:color="auto" w:sz="4"/>
+          <w:left w:val="single" w:color="auto" w:sz="4"/>
+          <w:bottom w:val="single" w:color="auto" w:sz="4"/>
+          <w:right w:val="single" w:color="auto" w:sz="4"/>
+          <w:insideH w:val="single" w:color="auto" w:sz="4"/>
+          <w:insideV w:val="single" w:color="auto" w:sz="4"/>
+        </w:tblBorders>
+      </w:tblPr>
+      <w:tblGrid>
+        <w:gridCol w:w="2929"/>
+        <w:gridCol w:w="2929"/>
+        <w:gridCol w:w="2929"/>
+      </w:tblGrid>
+      <w:tr>
+        <w:trPr>
+          <w:cantSplit/>
+        </w:trPr>
+        <w:tc>
+          <w:tcPr>
+            <w:tcW w:type="dxa" w:w="2929"/>
+            <w:tcBorders>
+              <w:top w:val="none" w:color="FFFFFF" w:sz="0"/>
+              <w:left w:val="none" w:color="FFFFFF" w:sz="0"/>
+              <w:bottom w:val="none" w:color="FFFFFF" w:sz="0"/>
+              <w:right w:val="none" w:color="FFFFFF" w:sz="0"/>
+            </w:tcBorders>
+          </w:tcPr>
+          <w:p>
+            <w:pPr>
+              <w:spacing w:line="240" w:lineRule="auto"/>
+              <w:jc w:val="center"/>
+            </w:pPr>
+            <w:r>
+              <w:drawing>
+                <wp:inline distT="0" distB="0" distL="0" distR="0">
+                  <wp:extent cx="1714500" cy="3714750"/>
+                  <wp:effectExtent t="0" r="0" b="0" l="0"/>
+                  <wp:docPr id="1" name="" descr="" title=""/>
+                  <wp:cNvGraphicFramePr>
+                    <a:graphicFrameLocks xmlns:a="http://schemas.openxmlformats.org/drawingml/2006/main" noChangeAspect="1"/>
+                  </wp:cNvGraphicFramePr>
+                  <a:graphic xmlns:a="http://schemas.openxmlformats.org/drawingml/2006/main">
+                    <a:graphicData uri="http://schemas.openxmlformats.org/drawingml/2006/picture">
+                      <pic:pic xmlns:pic="http://schemas.openxmlformats.org/drawingml/2006/picture">
+                        <pic:nvPicPr>
+                          <pic:cNvPr id="0" name="" descr=""/>
+                          <pic:cNvPicPr>
+                            <a:picLocks noChangeAspect="1" noChangeArrowheads="1"/>
+                          </pic:cNvPicPr>
+                        </pic:nvPicPr>
+                        <pic:blipFill>
+                          <a:blip r:embed="rId12" cstate="none"/>
+                          <a:srcRect/>
+                          <a:stretch>
+                            <a:fillRect/>
+                          </a:stretch>
+                        </pic:blipFill>
+                        <pic:spPr bwMode="auto">
+                          <a:xfrm>
+                            <a:off x="0" y="0"/>
+                            <a:ext cx="1714500" cy="3714750"/>
+                          </a:xfrm>
+                          <a:prstGeom prst="rect">
+                            <a:avLst/>
+                          </a:prstGeom>
+                        </pic:spPr>
+                      </pic:pic>
+                    </a:graphicData>
+                  </a:graphic>
+                </wp:inline>
+              </w:drawing>
+            </w:r>
+          </w:p>
+          <w:p>
+            <w:pPr>
+              <w:keepLines/>
+              <w:spacing w:after="220" w:before="60"/>
+              <w:jc w:val="center"/>
+            </w:pPr>
+            <w:r>
+              <w:rPr>
+                <w:rFonts w:ascii="Arial" w:cs="Arial" w:eastAsia="Arial" w:hAnsi="Arial"/>
+                <w:b/>
+                <w:bCs/>
+                <w:sz w:val="18"/>
+                <w:szCs w:val="18"/>
+              </w:rPr>
+              <w:t xml:space="preserve">Gambar L.1.</w:t>
+            </w:r>
+            <w:r>
+              <w:rPr>
+                <w:rFonts w:ascii="Arial" w:cs="Arial" w:eastAsia="Arial" w:hAnsi="Arial"/>
+                <w:sz w:val="18"/>
+                <w:szCs w:val="18"/>
+              </w:rPr>
+              <w:t xml:space="preserve"> Agenda Wali Kota di telepon pintar: konfirmasi Hadir, Tidak Hadir, atau disposisi kepada Wakil Wali Kota langsung dari kartu agenda</w:t>
+            </w:r>
+          </w:p>
+        </w:tc>
+        <w:tc>
+          <w:tcPr>
+            <w:tcW w:type="dxa" w:w="2929"/>
+            <w:tcBorders>
+              <w:top w:val="none" w:color="FFFFFF" w:sz="0"/>
+              <w:left w:val="none" w:color="FFFFFF" w:sz="0"/>
+              <w:bottom w:val="none" w:color="FFFFFF" w:sz="0"/>
+              <w:right w:val="none" w:color="FFFFFF" w:sz="0"/>
+            </w:tcBorders>
+          </w:tcPr>
+          <w:p>
+            <w:pPr>
+              <w:spacing w:line="240" w:lineRule="auto"/>
+              <w:jc w:val="center"/>
+            </w:pPr>
+            <w:r>
+              <w:drawing>
+                <wp:inline distT="0" distB="0" distL="0" distR="0">
+                  <wp:extent cx="1714500" cy="3714750"/>
+                  <wp:effectExtent t="0" r="0" b="0" l="0"/>
+                  <wp:docPr id="1" name="" descr="" title=""/>
+                  <wp:cNvGraphicFramePr>
+                    <a:graphicFrameLocks xmlns:a="http://schemas.openxmlformats.org/drawingml/2006/main" noChangeAspect="1"/>
+                  </wp:cNvGraphicFramePr>
+                  <a:graphic xmlns:a="http://schemas.openxmlformats.org/drawingml/2006/main">
+                    <a:graphicData uri="http://schemas.openxmlformats.org/drawingml/2006/picture">
+                      <pic:pic xmlns:pic="http://schemas.openxmlformats.org/drawingml/2006/picture">
+                        <pic:nvPicPr>
+                          <pic:cNvPr id="0" name="" descr=""/>
+                          <pic:cNvPicPr>
+                            <a:picLocks noChangeAspect="1" noChangeArrowheads="1"/>
+                          </pic:cNvPicPr>
+                        </pic:nvPicPr>
+                        <pic:blipFill>
+                          <a:blip r:embed="rId13" cstate="none"/>
+                          <a:srcRect/>
+                          <a:stretch>
+                            <a:fillRect/>
+                          </a:stretch>
+                        </pic:blipFill>
+                        <pic:spPr bwMode="auto">
+                          <a:xfrm>
+                            <a:off x="0" y="0"/>
+                            <a:ext cx="1714500" cy="3714750"/>
+                          </a:xfrm>
+                          <a:prstGeom prst="rect">
+                            <a:avLst/>
+                          </a:prstGeom>
+                        </pic:spPr>
+                      </pic:pic>
+                    </a:graphicData>
+                  </a:graphic>
+                </wp:inline>
+              </w:drawing>
+            </w:r>
+          </w:p>
+          <w:p>
+            <w:pPr>
+              <w:keepLines/>
+              <w:spacing w:after="220" w:before="60"/>
+              <w:jc w:val="center"/>
+            </w:pPr>
+            <w:r>
+              <w:rPr>
+                <w:rFonts w:ascii="Arial" w:cs="Arial" w:eastAsia="Arial" w:hAnsi="Arial"/>
+                <w:b/>
+                <w:bCs/>
+                <w:sz w:val="18"/>
+                <w:szCs w:val="18"/>
+              </w:rPr>
+              <w:t xml:space="preserve">Gambar L.2.</w:t>
+            </w:r>
+            <w:r>
+              <w:rPr>
+                <w:rFonts w:ascii="Arial" w:cs="Arial" w:eastAsia="Arial" w:hAnsi="Arial"/>
+                <w:sz w:val="18"/>
+                <w:szCs w:val="18"/>
+              </w:rPr>
+              <w:t xml:space="preserve"> Layar ajudan: jadwal hari ini dan besok yang belum dikonfirmasi, dengan pilihan hadir, tidak hadir, delegasi, atau diwakilkan</w:t>
+            </w:r>
+          </w:p>
+        </w:tc>
+        <w:tc>
+          <w:tcPr>
+            <w:tcW w:type="dxa" w:w="2929"/>
+            <w:tcBorders>
+              <w:top w:val="none" w:color="FFFFFF" w:sz="0"/>
+              <w:left w:val="none" w:color="FFFFFF" w:sz="0"/>
+              <w:bottom w:val="none" w:color="FFFFFF" w:sz="0"/>
+              <w:right w:val="none" w:color="FFFFFF" w:sz="0"/>
+            </w:tcBorders>
+          </w:tcPr>
+          <w:p>
+            <w:pPr>
+              <w:spacing w:line="240" w:lineRule="auto"/>
+              <w:jc w:val="center"/>
+            </w:pPr>
+            <w:r>
+              <w:drawing>
+                <wp:inline distT="0" distB="0" distL="0" distR="0">
+                  <wp:extent cx="1714500" cy="3714750"/>
+                  <wp:effectExtent t="0" r="0" b="0" l="0"/>
+                  <wp:docPr id="1" name="" descr="" title=""/>
+                  <wp:cNvGraphicFramePr>
+                    <a:graphicFrameLocks xmlns:a="http://schemas.openxmlformats.org/drawingml/2006/main" noChangeAspect="1"/>
+                  </wp:cNvGraphicFramePr>
+                  <a:graphic xmlns:a="http://schemas.openxmlformats.org/drawingml/2006/main">
+                    <a:graphicData uri="http://schemas.openxmlformats.org/drawingml/2006/picture">
+                      <pic:pic xmlns:pic="http://schemas.openxmlformats.org/drawingml/2006/picture">
+                        <pic:nvPicPr>
+                          <pic:cNvPr id="0" name="" descr=""/>
+                          <pic:cNvPicPr>
+                            <a:picLocks noChangeAspect="1" noChangeArrowheads="1"/>
+                          </pic:cNvPicPr>
+                        </pic:nvPicPr>
+                        <pic:blipFill>
+                          <a:blip r:embed="rId14" cstate="none"/>
+                          <a:srcRect/>
+                          <a:stretch>
+                            <a:fillRect/>
+                          </a:stretch>
+                        </pic:blipFill>
+                        <pic:spPr bwMode="auto">
+                          <a:xfrm>
+                            <a:off x="0" y="0"/>
+                            <a:ext cx="1714500" cy="3714750"/>
+                          </a:xfrm>
+                          <a:prstGeom prst="rect">
+                            <a:avLst/>
+                          </a:prstGeom>
+                        </pic:spPr>
+                      </pic:pic>
+                    </a:graphicData>
+                  </a:graphic>
+                </wp:inline>
+              </w:drawing>
+            </w:r>
+          </w:p>
+          <w:p>
+            <w:pPr>
+              <w:keepLines/>
+              <w:spacing w:after="220" w:before="60"/>
+              <w:jc w:val="center"/>
+            </w:pPr>
+            <w:r>
+              <w:rPr>
+                <w:rFonts w:ascii="Arial" w:cs="Arial" w:eastAsia="Arial" w:hAnsi="Arial"/>
+                <w:b/>
+                <w:bCs/>
+                <w:sz w:val="18"/>
+                <w:szCs w:val="18"/>
+              </w:rPr>
+              <w:t xml:space="preserve">Gambar L.3.</w:t>
+            </w:r>
+            <w:r>
+              <w:rPr>
+                <w:rFonts w:ascii="Arial" w:cs="Arial" w:eastAsia="Arial" w:hAnsi="Arial"/>
+                <w:sz w:val="18"/>
+                <w:szCs w:val="18"/>
+              </w:rPr>
+              <w:t xml:space="preserve"> Layar petugas: penugasan mendatang dengan hitung mundur, rekan bertugas, dan pengingat evaluasi</w:t>
+            </w:r>
+          </w:p>
+        </w:tc>
+      </w:tr>
+    </w:tbl>
     <w:p>
       <w:pPr>
         <w:keepNext/>
@@ -21128,7 +21413,7 @@
       <w:r>
         <w:drawing>
           <wp:inline distT="0" distB="0" distL="0" distR="0">
-            <wp:extent cx="5143500" cy="3457575"/>
+            <wp:extent cx="5048250" cy="3390900"/>
             <wp:effectExtent t="0" r="0" b="0" l="0"/>
             <wp:docPr id="1" name="" descr="" title=""/>
             <wp:cNvGraphicFramePr>
@@ -21144,7 +21429,7 @@
                     </pic:cNvPicPr>
                   </pic:nvPicPr>
                   <pic:blipFill>
-                    <a:blip r:embed="rId12" cstate="none"/>
+                    <a:blip r:embed="rId15" cstate="none"/>
                     <a:srcRect/>
                     <a:stretch>
                       <a:fillRect/>
@@ -21153,7 +21438,7 @@
                   <pic:spPr bwMode="auto">
                     <a:xfrm>
                       <a:off x="0" y="0"/>
-                      <a:ext cx="5143500" cy="3457575"/>
+                      <a:ext cx="5048250" cy="3390900"/>
                     </a:xfrm>
                     <a:prstGeom prst="rect">
                       <a:avLst/>
@@ -21168,7 +21453,8 @@
     </w:p>
     <w:p>
       <w:pPr>
-        <w:spacing w:after="200" w:before="60"/>
+        <w:keepLines/>
+        <w:spacing w:after="220" w:before="60"/>
         <w:jc w:val="center"/>
       </w:pPr>
       <w:r>
@@ -21176,10 +21462,34 @@
           <w:rFonts w:ascii="Arial" w:cs="Arial" w:eastAsia="Arial" w:hAnsi="Arial"/>
           <w:b/>
           <w:bCs/>
-          <w:sz w:val="20"/>
-          <w:szCs w:val="20"/>
-        </w:rPr>
-        <w:t xml:space="preserve">Gambar L.1. Antrian persetujuan Kepala Bagian dengan daftar periksa wajib</w:t>
+          <w:sz w:val="18"/>
+          <w:szCs w:val="18"/>
+        </w:rPr>
+        <w:t xml:space="preserve">Gambar L.4.</w:t>
+      </w:r>
+      <w:r>
+        <w:rPr>
+          <w:rFonts w:ascii="Arial" w:cs="Arial" w:eastAsia="Arial" w:hAnsi="Arial"/>
+          <w:sz w:val="18"/>
+          <w:szCs w:val="18"/>
+        </w:rPr>
+        <w:t xml:space="preserve"> Akun mitra kerja (contoh: DKISP) hanya melihat agenda yang telah ditetapkan, lengkap dengan status kehadiran Pimpinan</w:t>
+      </w:r>
+    </w:p>
+    <w:p>
+      <w:pPr>
+        <w:keepNext/>
+        <w:spacing w:after="120" w:before="120"/>
+      </w:pPr>
+      <w:r>
+        <w:rPr>
+          <w:rFonts w:ascii="Arial" w:cs="Arial" w:eastAsia="Arial" w:hAnsi="Arial"/>
+          <w:b/>
+          <w:bCs/>
+          <w:sz w:val="22"/>
+          <w:szCs w:val="22"/>
+        </w:rPr>
+        <w:t xml:space="preserve">B. Pejabat Struktural: Kendali Mutu dan Akuntabilitas</w:t>
       </w:r>
     </w:p>
     <w:p>
@@ -21191,7 +21501,7 @@
       <w:r>
         <w:drawing>
           <wp:inline distT="0" distB="0" distL="0" distR="0">
-            <wp:extent cx="5143500" cy="3457575"/>
+            <wp:extent cx="4191000" cy="3467100"/>
             <wp:effectExtent t="0" r="0" b="0" l="0"/>
             <wp:docPr id="1" name="" descr="" title=""/>
             <wp:cNvGraphicFramePr>
@@ -21207,7 +21517,7 @@
                     </pic:cNvPicPr>
                   </pic:nvPicPr>
                   <pic:blipFill>
-                    <a:blip r:embed="rId13" cstate="none"/>
+                    <a:blip r:embed="rId16" cstate="none"/>
                     <a:srcRect/>
                     <a:stretch>
                       <a:fillRect/>
@@ -21216,7 +21526,7 @@
                   <pic:spPr bwMode="auto">
                     <a:xfrm>
                       <a:off x="0" y="0"/>
-                      <a:ext cx="5143500" cy="3457575"/>
+                      <a:ext cx="4191000" cy="3467100"/>
                     </a:xfrm>
                     <a:prstGeom prst="rect">
                       <a:avLst/>
@@ -21231,7 +21541,8 @@
     </w:p>
     <w:p>
       <w:pPr>
-        <w:spacing w:after="200" w:before="60"/>
+        <w:keepLines/>
+        <w:spacing w:after="220" w:before="60"/>
         <w:jc w:val="center"/>
       </w:pPr>
       <w:r>
@@ -21239,10 +21550,18 @@
           <w:rFonts w:ascii="Arial" w:cs="Arial" w:eastAsia="Arial" w:hAnsi="Arial"/>
           <w:b/>
           <w:bCs/>
-          <w:sz w:val="20"/>
-          <w:szCs w:val="20"/>
-        </w:rPr>
-        <w:t xml:space="preserve">Gambar L.2. Riwayat alur (jejak audit) mencatat pelaku, waktu, dan butir pemeriksaan</w:t>
+          <w:sz w:val="18"/>
+          <w:szCs w:val="18"/>
+        </w:rPr>
+        <w:t xml:space="preserve">Gambar L.5.</w:t>
+      </w:r>
+      <w:r>
+        <w:rPr>
+          <w:rFonts w:ascii="Arial" w:cs="Arial" w:eastAsia="Arial" w:hAnsi="Arial"/>
+          <w:sz w:val="18"/>
+          <w:szCs w:val="18"/>
+        </w:rPr>
+        <w:t xml:space="preserve"> Antrean persetujuan Kepala Bagian: rincian kegiatan, riwayat alur, dan daftar periksa wajib. Butir “Undangan sudah dibuka” baru tercentang setelah berkas undangan dibuka</w:t>
       </w:r>
     </w:p>
     <w:p>
@@ -21254,7 +21573,7 @@
       <w:r>
         <w:drawing>
           <wp:inline distT="0" distB="0" distL="0" distR="0">
-            <wp:extent cx="5143500" cy="3457575"/>
+            <wp:extent cx="4191000" cy="3467100"/>
             <wp:effectExtent t="0" r="0" b="0" l="0"/>
             <wp:docPr id="1" name="" descr="" title=""/>
             <wp:cNvGraphicFramePr>
@@ -21270,7 +21589,7 @@
                     </pic:cNvPicPr>
                   </pic:nvPicPr>
                   <pic:blipFill>
-                    <a:blip r:embed="rId14" cstate="none"/>
+                    <a:blip r:embed="rId17" cstate="none"/>
                     <a:srcRect/>
                     <a:stretch>
                       <a:fillRect/>
@@ -21279,7 +21598,7 @@
                   <pic:spPr bwMode="auto">
                     <a:xfrm>
                       <a:off x="0" y="0"/>
-                      <a:ext cx="5143500" cy="3457575"/>
+                      <a:ext cx="4191000" cy="3467100"/>
                     </a:xfrm>
                     <a:prstGeom prst="rect">
                       <a:avLst/>
@@ -21294,7 +21613,8 @@
     </w:p>
     <w:p>
       <w:pPr>
-        <w:spacing w:after="200" w:before="60"/>
+        <w:keepLines/>
+        <w:spacing w:after="220" w:before="60"/>
         <w:jc w:val="center"/>
       </w:pPr>
       <w:r>
@@ -21302,10 +21622,858 @@
           <w:rFonts w:ascii="Arial" w:cs="Arial" w:eastAsia="Arial" w:hAnsi="Arial"/>
           <w:b/>
           <w:bCs/>
-          <w:sz w:val="20"/>
-          <w:szCs w:val="20"/>
-        </w:rPr>
-        <w:t xml:space="preserve">Gambar L.3. Jadwal tayang pada dasbor Kepala Sub Bagian, dengan peringatan kegiatan yang belum berpetugas</w:t>
+          <w:sz w:val="18"/>
+          <w:szCs w:val="18"/>
+        </w:rPr>
+        <w:t xml:space="preserve">Gambar L.6.</w:t>
+      </w:r>
+      <w:r>
+        <w:rPr>
+          <w:rFonts w:ascii="Arial" w:cs="Arial" w:eastAsia="Arial" w:hAnsi="Arial"/>
+          <w:sz w:val="18"/>
+          <w:szCs w:val="18"/>
+        </w:rPr>
+        <w:t xml:space="preserve"> Riwayat alur (jejak audit): setiap tahap tercatat dengan pelaku, waktu, dan catatan, berlanjut ke fase pelaksanaan (penugasan, konfirmasi kehadiran)</w:t>
+      </w:r>
+    </w:p>
+    <w:p>
+      <w:pPr>
+        <w:keepNext/>
+        <w:spacing w:after="0" w:line="240" w:lineRule="auto"/>
+        <w:jc w:val="center"/>
+      </w:pPr>
+      <w:r>
+        <w:drawing>
+          <wp:inline distT="0" distB="0" distL="0" distR="0">
+            <wp:extent cx="5048250" cy="3390900"/>
+            <wp:effectExtent t="0" r="0" b="0" l="0"/>
+            <wp:docPr id="1" name="" descr="" title=""/>
+            <wp:cNvGraphicFramePr>
+              <a:graphicFrameLocks xmlns:a="http://schemas.openxmlformats.org/drawingml/2006/main" noChangeAspect="1"/>
+            </wp:cNvGraphicFramePr>
+            <a:graphic xmlns:a="http://schemas.openxmlformats.org/drawingml/2006/main">
+              <a:graphicData uri="http://schemas.openxmlformats.org/drawingml/2006/picture">
+                <pic:pic xmlns:pic="http://schemas.openxmlformats.org/drawingml/2006/picture">
+                  <pic:nvPicPr>
+                    <pic:cNvPr id="0" name="" descr=""/>
+                    <pic:cNvPicPr>
+                      <a:picLocks noChangeAspect="1" noChangeArrowheads="1"/>
+                    </pic:cNvPicPr>
+                  </pic:nvPicPr>
+                  <pic:blipFill>
+                    <a:blip r:embed="rId18" cstate="none"/>
+                    <a:srcRect/>
+                    <a:stretch>
+                      <a:fillRect/>
+                    </a:stretch>
+                  </pic:blipFill>
+                  <pic:spPr bwMode="auto">
+                    <a:xfrm>
+                      <a:off x="0" y="0"/>
+                      <a:ext cx="5048250" cy="3390900"/>
+                    </a:xfrm>
+                    <a:prstGeom prst="rect">
+                      <a:avLst/>
+                    </a:prstGeom>
+                  </pic:spPr>
+                </pic:pic>
+              </a:graphicData>
+            </a:graphic>
+          </wp:inline>
+        </w:drawing>
+      </w:r>
+    </w:p>
+    <w:p>
+      <w:pPr>
+        <w:keepLines/>
+        <w:spacing w:after="220" w:before="60"/>
+        <w:jc w:val="center"/>
+      </w:pPr>
+      <w:r>
+        <w:rPr>
+          <w:rFonts w:ascii="Arial" w:cs="Arial" w:eastAsia="Arial" w:hAnsi="Arial"/>
+          <w:b/>
+          <w:bCs/>
+          <w:sz w:val="18"/>
+          <w:szCs w:val="18"/>
+        </w:rPr>
+        <w:t xml:space="preserve">Gambar L.7.</w:t>
+      </w:r>
+      <w:r>
+        <w:rPr>
+          <w:rFonts w:ascii="Arial" w:cs="Arial" w:eastAsia="Arial" w:hAnsi="Arial"/>
+          <w:sz w:val="18"/>
+          <w:szCs w:val="18"/>
+        </w:rPr>
+        <w:t xml:space="preserve"> Usulan perubahan jadwal yang sudah tayang: perbandingan nilai lama dan baru, penanda umur usulan, dan peringatan bahwa konfirmasi kehadiran akan diulang</w:t>
+      </w:r>
+    </w:p>
+    <w:p>
+      <w:pPr>
+        <w:keepNext/>
+        <w:spacing w:after="0" w:line="240" w:lineRule="auto"/>
+        <w:jc w:val="center"/>
+      </w:pPr>
+      <w:r>
+        <w:drawing>
+          <wp:inline distT="0" distB="0" distL="0" distR="0">
+            <wp:extent cx="5048250" cy="3390900"/>
+            <wp:effectExtent t="0" r="0" b="0" l="0"/>
+            <wp:docPr id="1" name="" descr="" title=""/>
+            <wp:cNvGraphicFramePr>
+              <a:graphicFrameLocks xmlns:a="http://schemas.openxmlformats.org/drawingml/2006/main" noChangeAspect="1"/>
+            </wp:cNvGraphicFramePr>
+            <a:graphic xmlns:a="http://schemas.openxmlformats.org/drawingml/2006/main">
+              <a:graphicData uri="http://schemas.openxmlformats.org/drawingml/2006/picture">
+                <pic:pic xmlns:pic="http://schemas.openxmlformats.org/drawingml/2006/picture">
+                  <pic:nvPicPr>
+                    <pic:cNvPr id="0" name="" descr=""/>
+                    <pic:cNvPicPr>
+                      <a:picLocks noChangeAspect="1" noChangeArrowheads="1"/>
+                    </pic:cNvPicPr>
+                  </pic:nvPicPr>
+                  <pic:blipFill>
+                    <a:blip r:embed="rId19" cstate="none"/>
+                    <a:srcRect/>
+                    <a:stretch>
+                      <a:fillRect/>
+                    </a:stretch>
+                  </pic:blipFill>
+                  <pic:spPr bwMode="auto">
+                    <a:xfrm>
+                      <a:off x="0" y="0"/>
+                      <a:ext cx="5048250" cy="3390900"/>
+                    </a:xfrm>
+                    <a:prstGeom prst="rect">
+                      <a:avLst/>
+                    </a:prstGeom>
+                  </pic:spPr>
+                </pic:pic>
+              </a:graphicData>
+            </a:graphic>
+          </wp:inline>
+        </w:drawing>
+      </w:r>
+    </w:p>
+    <w:p>
+      <w:pPr>
+        <w:keepLines/>
+        <w:spacing w:after="220" w:before="60"/>
+        <w:jc w:val="center"/>
+      </w:pPr>
+      <w:r>
+        <w:rPr>
+          <w:rFonts w:ascii="Arial" w:cs="Arial" w:eastAsia="Arial" w:hAnsi="Arial"/>
+          <w:b/>
+          <w:bCs/>
+          <w:sz w:val="18"/>
+          <w:szCs w:val="18"/>
+        </w:rPr>
+        <w:t xml:space="preserve">Gambar L.8.</w:t>
+      </w:r>
+      <w:r>
+        <w:rPr>
+          <w:rFonts w:ascii="Arial" w:cs="Arial" w:eastAsia="Arial" w:hAnsi="Arial"/>
+          <w:sz w:val="18"/>
+          <w:szCs w:val="18"/>
+        </w:rPr>
+        <w:t xml:space="preserve"> Dasbor Kepala Sub Bagian Protokol: peringatan agenda yang belum berpetugas dan daftar jadwal tayang beserta petugasnya</w:t>
+      </w:r>
+    </w:p>
+    <w:p>
+      <w:pPr>
+        <w:keepNext/>
+        <w:spacing w:after="0" w:line="240" w:lineRule="auto"/>
+        <w:jc w:val="center"/>
+      </w:pPr>
+      <w:r>
+        <w:drawing>
+          <wp:inline distT="0" distB="0" distL="0" distR="0">
+            <wp:extent cx="5048250" cy="3390900"/>
+            <wp:effectExtent t="0" r="0" b="0" l="0"/>
+            <wp:docPr id="1" name="" descr="" title=""/>
+            <wp:cNvGraphicFramePr>
+              <a:graphicFrameLocks xmlns:a="http://schemas.openxmlformats.org/drawingml/2006/main" noChangeAspect="1"/>
+            </wp:cNvGraphicFramePr>
+            <a:graphic xmlns:a="http://schemas.openxmlformats.org/drawingml/2006/main">
+              <a:graphicData uri="http://schemas.openxmlformats.org/drawingml/2006/picture">
+                <pic:pic xmlns:pic="http://schemas.openxmlformats.org/drawingml/2006/picture">
+                  <pic:nvPicPr>
+                    <pic:cNvPr id="0" name="" descr=""/>
+                    <pic:cNvPicPr>
+                      <a:picLocks noChangeAspect="1" noChangeArrowheads="1"/>
+                    </pic:cNvPicPr>
+                  </pic:nvPicPr>
+                  <pic:blipFill>
+                    <a:blip r:embed="rId20" cstate="none"/>
+                    <a:srcRect/>
+                    <a:stretch>
+                      <a:fillRect/>
+                    </a:stretch>
+                  </pic:blipFill>
+                  <pic:spPr bwMode="auto">
+                    <a:xfrm>
+                      <a:off x="0" y="0"/>
+                      <a:ext cx="5048250" cy="3390900"/>
+                    </a:xfrm>
+                    <a:prstGeom prst="rect">
+                      <a:avLst/>
+                    </a:prstGeom>
+                  </pic:spPr>
+                </pic:pic>
+              </a:graphicData>
+            </a:graphic>
+          </wp:inline>
+        </w:drawing>
+      </w:r>
+    </w:p>
+    <w:p>
+      <w:pPr>
+        <w:keepLines/>
+        <w:spacing w:after="220" w:before="60"/>
+        <w:jc w:val="center"/>
+      </w:pPr>
+      <w:r>
+        <w:rPr>
+          <w:rFonts w:ascii="Arial" w:cs="Arial" w:eastAsia="Arial" w:hAnsi="Arial"/>
+          <w:b/>
+          <w:bCs/>
+          <w:sz w:val="18"/>
+          <w:szCs w:val="18"/>
+        </w:rPr>
+        <w:t xml:space="preserve">Gambar L.9.</w:t>
+      </w:r>
+      <w:r>
+        <w:rPr>
+          <w:rFonts w:ascii="Arial" w:cs="Arial" w:eastAsia="Arial" w:hAnsi="Arial"/>
+          <w:sz w:val="18"/>
+          <w:szCs w:val="18"/>
+        </w:rPr>
+        <w:t xml:space="preserve"> Sebaran beban penugasan per petugas, sehingga penugasan dapat dibagi merata</w:t>
+      </w:r>
+    </w:p>
+    <w:p>
+      <w:pPr>
+        <w:keepNext/>
+        <w:spacing w:after="0" w:line="240" w:lineRule="auto"/>
+        <w:jc w:val="center"/>
+      </w:pPr>
+      <w:r>
+        <w:drawing>
+          <wp:inline distT="0" distB="0" distL="0" distR="0">
+            <wp:extent cx="5048250" cy="3390900"/>
+            <wp:effectExtent t="0" r="0" b="0" l="0"/>
+            <wp:docPr id="1" name="" descr="" title=""/>
+            <wp:cNvGraphicFramePr>
+              <a:graphicFrameLocks xmlns:a="http://schemas.openxmlformats.org/drawingml/2006/main" noChangeAspect="1"/>
+            </wp:cNvGraphicFramePr>
+            <a:graphic xmlns:a="http://schemas.openxmlformats.org/drawingml/2006/main">
+              <a:graphicData uri="http://schemas.openxmlformats.org/drawingml/2006/picture">
+                <pic:pic xmlns:pic="http://schemas.openxmlformats.org/drawingml/2006/picture">
+                  <pic:nvPicPr>
+                    <pic:cNvPr id="0" name="" descr=""/>
+                    <pic:cNvPicPr>
+                      <a:picLocks noChangeAspect="1" noChangeArrowheads="1"/>
+                    </pic:cNvPicPr>
+                  </pic:nvPicPr>
+                  <pic:blipFill>
+                    <a:blip r:embed="rId21" cstate="none"/>
+                    <a:srcRect/>
+                    <a:stretch>
+                      <a:fillRect/>
+                    </a:stretch>
+                  </pic:blipFill>
+                  <pic:spPr bwMode="auto">
+                    <a:xfrm>
+                      <a:off x="0" y="0"/>
+                      <a:ext cx="5048250" cy="3390900"/>
+                    </a:xfrm>
+                    <a:prstGeom prst="rect">
+                      <a:avLst/>
+                    </a:prstGeom>
+                  </pic:spPr>
+                </pic:pic>
+              </a:graphicData>
+            </a:graphic>
+          </wp:inline>
+        </w:drawing>
+      </w:r>
+    </w:p>
+    <w:p>
+      <w:pPr>
+        <w:keepLines/>
+        <w:spacing w:after="220" w:before="60"/>
+        <w:jc w:val="center"/>
+      </w:pPr>
+      <w:r>
+        <w:rPr>
+          <w:rFonts w:ascii="Arial" w:cs="Arial" w:eastAsia="Arial" w:hAnsi="Arial"/>
+          <w:b/>
+          <w:bCs/>
+          <w:sz w:val="18"/>
+          <w:szCs w:val="18"/>
+        </w:rPr>
+        <w:t xml:space="preserve">Gambar L.10.</w:t>
+      </w:r>
+      <w:r>
+        <w:rPr>
+          <w:rFonts w:ascii="Arial" w:cs="Arial" w:eastAsia="Arial" w:hAnsi="Arial"/>
+          <w:sz w:val="18"/>
+          <w:szCs w:val="18"/>
+        </w:rPr>
+        <w:t xml:space="preserve"> Penetapan Pelaksana Harian berdasarkan Surat Perintah, dengan masa berlaku yang padam dengan sendirinya</w:t>
+      </w:r>
+    </w:p>
+    <w:p>
+      <w:pPr>
+        <w:keepNext/>
+        <w:spacing w:after="0" w:line="240" w:lineRule="auto"/>
+        <w:jc w:val="center"/>
+      </w:pPr>
+      <w:r>
+        <w:drawing>
+          <wp:inline distT="0" distB="0" distL="0" distR="0">
+            <wp:extent cx="5048250" cy="3390900"/>
+            <wp:effectExtent t="0" r="0" b="0" l="0"/>
+            <wp:docPr id="1" name="" descr="" title=""/>
+            <wp:cNvGraphicFramePr>
+              <a:graphicFrameLocks xmlns:a="http://schemas.openxmlformats.org/drawingml/2006/main" noChangeAspect="1"/>
+            </wp:cNvGraphicFramePr>
+            <a:graphic xmlns:a="http://schemas.openxmlformats.org/drawingml/2006/main">
+              <a:graphicData uri="http://schemas.openxmlformats.org/drawingml/2006/picture">
+                <pic:pic xmlns:pic="http://schemas.openxmlformats.org/drawingml/2006/picture">
+                  <pic:nvPicPr>
+                    <pic:cNvPr id="0" name="" descr=""/>
+                    <pic:cNvPicPr>
+                      <a:picLocks noChangeAspect="1" noChangeArrowheads="1"/>
+                    </pic:cNvPicPr>
+                  </pic:nvPicPr>
+                  <pic:blipFill>
+                    <a:blip r:embed="rId22" cstate="none"/>
+                    <a:srcRect/>
+                    <a:stretch>
+                      <a:fillRect/>
+                    </a:stretch>
+                  </pic:blipFill>
+                  <pic:spPr bwMode="auto">
+                    <a:xfrm>
+                      <a:off x="0" y="0"/>
+                      <a:ext cx="5048250" cy="3390900"/>
+                    </a:xfrm>
+                    <a:prstGeom prst="rect">
+                      <a:avLst/>
+                    </a:prstGeom>
+                  </pic:spPr>
+                </pic:pic>
+              </a:graphicData>
+            </a:graphic>
+          </wp:inline>
+        </w:drawing>
+      </w:r>
+    </w:p>
+    <w:p>
+      <w:pPr>
+        <w:keepLines/>
+        <w:spacing w:after="220" w:before="60"/>
+        <w:jc w:val="center"/>
+      </w:pPr>
+      <w:r>
+        <w:rPr>
+          <w:rFonts w:ascii="Arial" w:cs="Arial" w:eastAsia="Arial" w:hAnsi="Arial"/>
+          <w:b/>
+          <w:bCs/>
+          <w:sz w:val="18"/>
+          <w:szCs w:val="18"/>
+        </w:rPr>
+        <w:t xml:space="preserve">Gambar L.11.</w:t>
+      </w:r>
+      <w:r>
+        <w:rPr>
+          <w:rFonts w:ascii="Arial" w:cs="Arial" w:eastAsia="Arial" w:hAnsi="Arial"/>
+          <w:sz w:val="18"/>
+          <w:szCs w:val="18"/>
+        </w:rPr>
+        <w:t xml:space="preserve"> Tampilan Pelaksana Harian: penanda kewenangan yang sedang diampu beserta dasar dan batas waktunya</w:t>
+      </w:r>
+    </w:p>
+    <w:p>
+      <w:pPr>
+        <w:keepNext/>
+        <w:spacing w:after="120" w:before="120"/>
+      </w:pPr>
+      <w:r>
+        <w:rPr>
+          <w:rFonts w:ascii="Arial" w:cs="Arial" w:eastAsia="Arial" w:hAnsi="Arial"/>
+          <w:b/>
+          <w:bCs/>
+          <w:sz w:val="22"/>
+          <w:szCs w:val="22"/>
+        </w:rPr>
+        <w:t xml:space="preserve">C. Petugas: Penugasan, Evaluasi, dan Rekap Kinerja</w:t>
+      </w:r>
+    </w:p>
+    <w:p>
+      <w:pPr>
+        <w:keepNext/>
+        <w:spacing w:after="0" w:line="240" w:lineRule="auto"/>
+        <w:jc w:val="center"/>
+      </w:pPr>
+      <w:r>
+        <w:drawing>
+          <wp:inline distT="0" distB="0" distL="0" distR="0">
+            <wp:extent cx="5048250" cy="3390900"/>
+            <wp:effectExtent t="0" r="0" b="0" l="0"/>
+            <wp:docPr id="1" name="" descr="" title=""/>
+            <wp:cNvGraphicFramePr>
+              <a:graphicFrameLocks xmlns:a="http://schemas.openxmlformats.org/drawingml/2006/main" noChangeAspect="1"/>
+            </wp:cNvGraphicFramePr>
+            <a:graphic xmlns:a="http://schemas.openxmlformats.org/drawingml/2006/main">
+              <a:graphicData uri="http://schemas.openxmlformats.org/drawingml/2006/picture">
+                <pic:pic xmlns:pic="http://schemas.openxmlformats.org/drawingml/2006/picture">
+                  <pic:nvPicPr>
+                    <pic:cNvPr id="0" name="" descr=""/>
+                    <pic:cNvPicPr>
+                      <a:picLocks noChangeAspect="1" noChangeArrowheads="1"/>
+                    </pic:cNvPicPr>
+                  </pic:nvPicPr>
+                  <pic:blipFill>
+                    <a:blip r:embed="rId23" cstate="none"/>
+                    <a:srcRect/>
+                    <a:stretch>
+                      <a:fillRect/>
+                    </a:stretch>
+                  </pic:blipFill>
+                  <pic:spPr bwMode="auto">
+                    <a:xfrm>
+                      <a:off x="0" y="0"/>
+                      <a:ext cx="5048250" cy="3390900"/>
+                    </a:xfrm>
+                    <a:prstGeom prst="rect">
+                      <a:avLst/>
+                    </a:prstGeom>
+                  </pic:spPr>
+                </pic:pic>
+              </a:graphicData>
+            </a:graphic>
+          </wp:inline>
+        </w:drawing>
+      </w:r>
+    </w:p>
+    <w:p>
+      <w:pPr>
+        <w:keepLines/>
+        <w:spacing w:after="220" w:before="60"/>
+        <w:jc w:val="center"/>
+      </w:pPr>
+      <w:r>
+        <w:rPr>
+          <w:rFonts w:ascii="Arial" w:cs="Arial" w:eastAsia="Arial" w:hAnsi="Arial"/>
+          <w:b/>
+          <w:bCs/>
+          <w:sz w:val="18"/>
+          <w:szCs w:val="18"/>
+        </w:rPr>
+        <w:t xml:space="preserve">Gambar L.12.</w:t>
+      </w:r>
+      <w:r>
+        <w:rPr>
+          <w:rFonts w:ascii="Arial" w:cs="Arial" w:eastAsia="Arial" w:hAnsi="Arial"/>
+          <w:sz w:val="18"/>
+          <w:szCs w:val="18"/>
+        </w:rPr>
+        <w:t xml:space="preserve"> Rekap Kinerja Saya: jumlah penugasan lapangan dan naskah per bulan, dengan cetak bukti dukung kinerja</w:t>
+      </w:r>
+    </w:p>
+    <w:p>
+      <w:pPr>
+        <w:keepNext/>
+        <w:spacing w:after="0" w:line="240" w:lineRule="auto"/>
+        <w:jc w:val="center"/>
+      </w:pPr>
+      <w:r>
+        <w:drawing>
+          <wp:inline distT="0" distB="0" distL="0" distR="0">
+            <wp:extent cx="5048250" cy="3390900"/>
+            <wp:effectExtent t="0" r="0" b="0" l="0"/>
+            <wp:docPr id="1" name="" descr="" title=""/>
+            <wp:cNvGraphicFramePr>
+              <a:graphicFrameLocks xmlns:a="http://schemas.openxmlformats.org/drawingml/2006/main" noChangeAspect="1"/>
+            </wp:cNvGraphicFramePr>
+            <a:graphic xmlns:a="http://schemas.openxmlformats.org/drawingml/2006/main">
+              <a:graphicData uri="http://schemas.openxmlformats.org/drawingml/2006/picture">
+                <pic:pic xmlns:pic="http://schemas.openxmlformats.org/drawingml/2006/picture">
+                  <pic:nvPicPr>
+                    <pic:cNvPr id="0" name="" descr=""/>
+                    <pic:cNvPicPr>
+                      <a:picLocks noChangeAspect="1" noChangeArrowheads="1"/>
+                    </pic:cNvPicPr>
+                  </pic:nvPicPr>
+                  <pic:blipFill>
+                    <a:blip r:embed="rId24" cstate="none"/>
+                    <a:srcRect/>
+                    <a:stretch>
+                      <a:fillRect/>
+                    </a:stretch>
+                  </pic:blipFill>
+                  <pic:spPr bwMode="auto">
+                    <a:xfrm>
+                      <a:off x="0" y="0"/>
+                      <a:ext cx="5048250" cy="3390900"/>
+                    </a:xfrm>
+                    <a:prstGeom prst="rect">
+                      <a:avLst/>
+                    </a:prstGeom>
+                  </pic:spPr>
+                </pic:pic>
+              </a:graphicData>
+            </a:graphic>
+          </wp:inline>
+        </w:drawing>
+      </w:r>
+    </w:p>
+    <w:p>
+      <w:pPr>
+        <w:keepLines/>
+        <w:spacing w:after="220" w:before="60"/>
+        <w:jc w:val="center"/>
+      </w:pPr>
+      <w:r>
+        <w:rPr>
+          <w:rFonts w:ascii="Arial" w:cs="Arial" w:eastAsia="Arial" w:hAnsi="Arial"/>
+          <w:b/>
+          <w:bCs/>
+          <w:sz w:val="18"/>
+          <w:szCs w:val="18"/>
+        </w:rPr>
+        <w:t xml:space="preserve">Gambar L.13.</w:t>
+      </w:r>
+      <w:r>
+        <w:rPr>
+          <w:rFonts w:ascii="Arial" w:cs="Arial" w:eastAsia="Arial" w:hAnsi="Arial"/>
+          <w:sz w:val="18"/>
+          <w:szCs w:val="18"/>
+        </w:rPr>
+        <w:t xml:space="preserve"> Generator laporan E-Kinerja: uraian kegiatan harian disusun otomatis dari penugasan, siap disalin ke aplikasi e-Kinerja</w:t>
+      </w:r>
+    </w:p>
+    <w:p>
+      <w:pPr>
+        <w:keepNext/>
+        <w:spacing w:after="0" w:line="240" w:lineRule="auto"/>
+        <w:jc w:val="center"/>
+      </w:pPr>
+      <w:r>
+        <w:drawing>
+          <wp:inline distT="0" distB="0" distL="0" distR="0">
+            <wp:extent cx="5048250" cy="3390900"/>
+            <wp:effectExtent t="0" r="0" b="0" l="0"/>
+            <wp:docPr id="1" name="" descr="" title=""/>
+            <wp:cNvGraphicFramePr>
+              <a:graphicFrameLocks xmlns:a="http://schemas.openxmlformats.org/drawingml/2006/main" noChangeAspect="1"/>
+            </wp:cNvGraphicFramePr>
+            <a:graphic xmlns:a="http://schemas.openxmlformats.org/drawingml/2006/main">
+              <a:graphicData uri="http://schemas.openxmlformats.org/drawingml/2006/picture">
+                <pic:pic xmlns:pic="http://schemas.openxmlformats.org/drawingml/2006/picture">
+                  <pic:nvPicPr>
+                    <pic:cNvPr id="0" name="" descr=""/>
+                    <pic:cNvPicPr>
+                      <a:picLocks noChangeAspect="1" noChangeArrowheads="1"/>
+                    </pic:cNvPicPr>
+                  </pic:nvPicPr>
+                  <pic:blipFill>
+                    <a:blip r:embed="rId25" cstate="none"/>
+                    <a:srcRect/>
+                    <a:stretch>
+                      <a:fillRect/>
+                    </a:stretch>
+                  </pic:blipFill>
+                  <pic:spPr bwMode="auto">
+                    <a:xfrm>
+                      <a:off x="0" y="0"/>
+                      <a:ext cx="5048250" cy="3390900"/>
+                    </a:xfrm>
+                    <a:prstGeom prst="rect">
+                      <a:avLst/>
+                    </a:prstGeom>
+                  </pic:spPr>
+                </pic:pic>
+              </a:graphicData>
+            </a:graphic>
+          </wp:inline>
+        </w:drawing>
+      </w:r>
+    </w:p>
+    <w:p>
+      <w:pPr>
+        <w:keepLines/>
+        <w:spacing w:after="220" w:before="60"/>
+        <w:jc w:val="center"/>
+      </w:pPr>
+      <w:r>
+        <w:rPr>
+          <w:rFonts w:ascii="Arial" w:cs="Arial" w:eastAsia="Arial" w:hAnsi="Arial"/>
+          <w:b/>
+          <w:bCs/>
+          <w:sz w:val="18"/>
+          <w:szCs w:val="18"/>
+        </w:rPr>
+        <w:t xml:space="preserve">Gambar L.14.</w:t>
+      </w:r>
+      <w:r>
+        <w:rPr>
+          <w:rFonts w:ascii="Arial" w:cs="Arial" w:eastAsia="Arial" w:hAnsi="Arial"/>
+          <w:sz w:val="18"/>
+          <w:szCs w:val="18"/>
+        </w:rPr>
+        <w:t xml:space="preserve"> Evaluasi kinerja organisasi: skor per tim dan per kriteria dari evaluasi pascakegiatan yang diisi petugas</w:t>
+      </w:r>
+    </w:p>
+    <w:p>
+      <w:pPr>
+        <w:keepNext/>
+        <w:spacing w:after="0" w:line="240" w:lineRule="auto"/>
+        <w:jc w:val="center"/>
+      </w:pPr>
+      <w:r>
+        <w:drawing>
+          <wp:inline distT="0" distB="0" distL="0" distR="0">
+            <wp:extent cx="5048250" cy="3390900"/>
+            <wp:effectExtent t="0" r="0" b="0" l="0"/>
+            <wp:docPr id="1" name="" descr="" title=""/>
+            <wp:cNvGraphicFramePr>
+              <a:graphicFrameLocks xmlns:a="http://schemas.openxmlformats.org/drawingml/2006/main" noChangeAspect="1"/>
+            </wp:cNvGraphicFramePr>
+            <a:graphic xmlns:a="http://schemas.openxmlformats.org/drawingml/2006/main">
+              <a:graphicData uri="http://schemas.openxmlformats.org/drawingml/2006/picture">
+                <pic:pic xmlns:pic="http://schemas.openxmlformats.org/drawingml/2006/picture">
+                  <pic:nvPicPr>
+                    <pic:cNvPr id="0" name="" descr=""/>
+                    <pic:cNvPicPr>
+                      <a:picLocks noChangeAspect="1" noChangeArrowheads="1"/>
+                    </pic:cNvPicPr>
+                  </pic:nvPicPr>
+                  <pic:blipFill>
+                    <a:blip r:embed="rId26" cstate="none"/>
+                    <a:srcRect/>
+                    <a:stretch>
+                      <a:fillRect/>
+                    </a:stretch>
+                  </pic:blipFill>
+                  <pic:spPr bwMode="auto">
+                    <a:xfrm>
+                      <a:off x="0" y="0"/>
+                      <a:ext cx="5048250" cy="3390900"/>
+                    </a:xfrm>
+                    <a:prstGeom prst="rect">
+                      <a:avLst/>
+                    </a:prstGeom>
+                  </pic:spPr>
+                </pic:pic>
+              </a:graphicData>
+            </a:graphic>
+          </wp:inline>
+        </w:drawing>
+      </w:r>
+    </w:p>
+    <w:p>
+      <w:pPr>
+        <w:keepLines/>
+        <w:spacing w:after="220" w:before="60"/>
+        <w:jc w:val="center"/>
+      </w:pPr>
+      <w:r>
+        <w:rPr>
+          <w:rFonts w:ascii="Arial" w:cs="Arial" w:eastAsia="Arial" w:hAnsi="Arial"/>
+          <w:b/>
+          <w:bCs/>
+          <w:sz w:val="18"/>
+          <w:szCs w:val="18"/>
+        </w:rPr>
+        <w:t xml:space="preserve">Gambar L.15.</w:t>
+      </w:r>
+      <w:r>
+        <w:rPr>
+          <w:rFonts w:ascii="Arial" w:cs="Arial" w:eastAsia="Arial" w:hAnsi="Arial"/>
+          <w:sz w:val="18"/>
+          <w:szCs w:val="18"/>
+        </w:rPr>
+        <w:t xml:space="preserve"> Rekap penugasan bulanan per tim dan per petugas</w:t>
+      </w:r>
+    </w:p>
+    <w:p>
+      <w:pPr>
+        <w:keepNext/>
+        <w:spacing w:after="120" w:before="120"/>
+      </w:pPr>
+      <w:r>
+        <w:rPr>
+          <w:rFonts w:ascii="Arial" w:cs="Arial" w:eastAsia="Arial" w:hAnsi="Arial"/>
+          <w:b/>
+          <w:bCs/>
+          <w:sz w:val="22"/>
+          <w:szCs w:val="22"/>
+        </w:rPr>
+        <w:t xml:space="preserve">D. Komunikasi dan Dokumentasi Pimpinan</w:t>
+      </w:r>
+    </w:p>
+    <w:p>
+      <w:pPr>
+        <w:keepNext/>
+        <w:spacing w:after="0" w:line="240" w:lineRule="auto"/>
+        <w:jc w:val="center"/>
+      </w:pPr>
+      <w:r>
+        <w:drawing>
+          <wp:inline distT="0" distB="0" distL="0" distR="0">
+            <wp:extent cx="5048250" cy="3390900"/>
+            <wp:effectExtent t="0" r="0" b="0" l="0"/>
+            <wp:docPr id="1" name="" descr="" title=""/>
+            <wp:cNvGraphicFramePr>
+              <a:graphicFrameLocks xmlns:a="http://schemas.openxmlformats.org/drawingml/2006/main" noChangeAspect="1"/>
+            </wp:cNvGraphicFramePr>
+            <a:graphic xmlns:a="http://schemas.openxmlformats.org/drawingml/2006/main">
+              <a:graphicData uri="http://schemas.openxmlformats.org/drawingml/2006/picture">
+                <pic:pic xmlns:pic="http://schemas.openxmlformats.org/drawingml/2006/picture">
+                  <pic:nvPicPr>
+                    <pic:cNvPr id="0" name="" descr=""/>
+                    <pic:cNvPicPr>
+                      <a:picLocks noChangeAspect="1" noChangeArrowheads="1"/>
+                    </pic:cNvPicPr>
+                  </pic:nvPicPr>
+                  <pic:blipFill>
+                    <a:blip r:embed="rId27" cstate="none"/>
+                    <a:srcRect/>
+                    <a:stretch>
+                      <a:fillRect/>
+                    </a:stretch>
+                  </pic:blipFill>
+                  <pic:spPr bwMode="auto">
+                    <a:xfrm>
+                      <a:off x="0" y="0"/>
+                      <a:ext cx="5048250" cy="3390900"/>
+                    </a:xfrm>
+                    <a:prstGeom prst="rect">
+                      <a:avLst/>
+                    </a:prstGeom>
+                  </pic:spPr>
+                </pic:pic>
+              </a:graphicData>
+            </a:graphic>
+          </wp:inline>
+        </w:drawing>
+      </w:r>
+    </w:p>
+    <w:p>
+      <w:pPr>
+        <w:keepLines/>
+        <w:spacing w:after="220" w:before="60"/>
+        <w:jc w:val="center"/>
+      </w:pPr>
+      <w:r>
+        <w:rPr>
+          <w:rFonts w:ascii="Arial" w:cs="Arial" w:eastAsia="Arial" w:hAnsi="Arial"/>
+          <w:b/>
+          <w:bCs/>
+          <w:sz w:val="18"/>
+          <w:szCs w:val="18"/>
+        </w:rPr>
+        <w:t xml:space="preserve">Gambar L.16.</w:t>
+      </w:r>
+      <w:r>
+        <w:rPr>
+          <w:rFonts w:ascii="Arial" w:cs="Arial" w:eastAsia="Arial" w:hAnsi="Arial"/>
+          <w:sz w:val="18"/>
+          <w:szCs w:val="18"/>
+        </w:rPr>
+        <w:t xml:space="preserve"> Review caption oleh Kepala Sub Bagian Komunikasi dan Dokumentasi Pimpinan, dengan rancangan berbantuan kecerdasan buatan</w:t>
+      </w:r>
+    </w:p>
+    <w:p>
+      <w:pPr>
+        <w:keepNext/>
+        <w:spacing w:after="0" w:line="240" w:lineRule="auto"/>
+        <w:jc w:val="center"/>
+      </w:pPr>
+      <w:r>
+        <w:drawing>
+          <wp:inline distT="0" distB="0" distL="0" distR="0">
+            <wp:extent cx="5048250" cy="3390900"/>
+            <wp:effectExtent t="0" r="0" b="0" l="0"/>
+            <wp:docPr id="1" name="" descr="" title=""/>
+            <wp:cNvGraphicFramePr>
+              <a:graphicFrameLocks xmlns:a="http://schemas.openxmlformats.org/drawingml/2006/main" noChangeAspect="1"/>
+            </wp:cNvGraphicFramePr>
+            <a:graphic xmlns:a="http://schemas.openxmlformats.org/drawingml/2006/main">
+              <a:graphicData uri="http://schemas.openxmlformats.org/drawingml/2006/picture">
+                <pic:pic xmlns:pic="http://schemas.openxmlformats.org/drawingml/2006/picture">
+                  <pic:nvPicPr>
+                    <pic:cNvPr id="0" name="" descr=""/>
+                    <pic:cNvPicPr>
+                      <a:picLocks noChangeAspect="1" noChangeArrowheads="1"/>
+                    </pic:cNvPicPr>
+                  </pic:nvPicPr>
+                  <pic:blipFill>
+                    <a:blip r:embed="rId28" cstate="none"/>
+                    <a:srcRect/>
+                    <a:stretch>
+                      <a:fillRect/>
+                    </a:stretch>
+                  </pic:blipFill>
+                  <pic:spPr bwMode="auto">
+                    <a:xfrm>
+                      <a:off x="0" y="0"/>
+                      <a:ext cx="5048250" cy="3390900"/>
+                    </a:xfrm>
+                    <a:prstGeom prst="rect">
+                      <a:avLst/>
+                    </a:prstGeom>
+                  </pic:spPr>
+                </pic:pic>
+              </a:graphicData>
+            </a:graphic>
+          </wp:inline>
+        </w:drawing>
+      </w:r>
+    </w:p>
+    <w:p>
+      <w:pPr>
+        <w:keepLines/>
+        <w:spacing w:after="220" w:before="60"/>
+        <w:jc w:val="center"/>
+      </w:pPr>
+      <w:r>
+        <w:rPr>
+          <w:rFonts w:ascii="Arial" w:cs="Arial" w:eastAsia="Arial" w:hAnsi="Arial"/>
+          <w:b/>
+          <w:bCs/>
+          <w:sz w:val="18"/>
+          <w:szCs w:val="18"/>
+        </w:rPr>
+        <w:t xml:space="preserve">Gambar L.17.</w:t>
+      </w:r>
+      <w:r>
+        <w:rPr>
+          <w:rFonts w:ascii="Arial" w:cs="Arial" w:eastAsia="Arial" w:hAnsi="Arial"/>
+          <w:sz w:val="18"/>
+          <w:szCs w:val="18"/>
+        </w:rPr>
+        <w:t xml:space="preserve"> Pemantauan status caption seluruh agenda oleh Kepala Bagian</w:t>
+      </w:r>
+    </w:p>
+    <w:p>
+      <w:pPr>
+        <w:keepNext/>
+        <w:spacing w:after="120" w:before="120"/>
+      </w:pPr>
+      <w:r>
+        <w:rPr>
+          <w:rFonts w:ascii="Arial" w:cs="Arial" w:eastAsia="Arial" w:hAnsi="Arial"/>
+          <w:b/>
+          <w:bCs/>
+          <w:sz w:val="22"/>
+          <w:szCs w:val="22"/>
+        </w:rPr>
+        <w:t xml:space="preserve">E. Layanan Publik: Audiensi, Peminjaman Ruangan, dan Daftar Hadir</w:t>
       </w:r>
     </w:p>
     <w:tbl>
@@ -21321,8 +22489,9 @@
         </w:tblBorders>
       </w:tblPr>
       <w:tblGrid>
-        <w:gridCol w:w="4393"/>
-        <w:gridCol w:w="4394"/>
+        <w:gridCol w:w="2929"/>
+        <w:gridCol w:w="2929"/>
+        <w:gridCol w:w="2929"/>
       </w:tblGrid>
       <w:tr>
         <w:trPr>
@@ -21330,7 +22499,7 @@
         </w:trPr>
         <w:tc>
           <w:tcPr>
-            <w:tcW w:type="dxa" w:w="4393"/>
+            <w:tcW w:type="dxa" w:w="2929"/>
             <w:tcBorders>
               <w:top w:val="none" w:color="FFFFFF" w:sz="0"/>
               <w:left w:val="none" w:color="FFFFFF" w:sz="0"/>
@@ -21346,7 +22515,7 @@
             <w:r>
               <w:drawing>
                 <wp:inline distT="0" distB="0" distL="0" distR="0">
-                  <wp:extent cx="1905000" cy="4124325"/>
+                  <wp:extent cx="1714500" cy="3714750"/>
                   <wp:effectExtent t="0" r="0" b="0" l="0"/>
                   <wp:docPr id="1" name="" descr="" title=""/>
                   <wp:cNvGraphicFramePr>
@@ -21362,7 +22531,7 @@
                           </pic:cNvPicPr>
                         </pic:nvPicPr>
                         <pic:blipFill>
-                          <a:blip r:embed="rId15" cstate="none"/>
+                          <a:blip r:embed="rId29" cstate="none"/>
                           <a:srcRect/>
                           <a:stretch>
                             <a:fillRect/>
@@ -21371,7 +22540,7 @@
                         <pic:spPr bwMode="auto">
                           <a:xfrm>
                             <a:off x="0" y="0"/>
-                            <a:ext cx="1905000" cy="4124325"/>
+                            <a:ext cx="1714500" cy="3714750"/>
                           </a:xfrm>
                           <a:prstGeom prst="rect">
                             <a:avLst/>
@@ -21386,7 +22555,8 @@
           </w:p>
           <w:p>
             <w:pPr>
-              <w:spacing w:after="200" w:before="60"/>
+              <w:keepLines/>
+              <w:spacing w:after="220" w:before="60"/>
               <w:jc w:val="center"/>
             </w:pPr>
             <w:r>
@@ -21394,16 +22564,24 @@
                 <w:rFonts w:ascii="Arial" w:cs="Arial" w:eastAsia="Arial" w:hAnsi="Arial"/>
                 <w:b/>
                 <w:bCs/>
-                <w:sz w:val="20"/>
-                <w:szCs w:val="20"/>
-              </w:rPr>
-              <w:t xml:space="preserve">Gambar L.4. Agenda Wali Kota pada telepon pintar</w:t>
-            </w:r>
-          </w:p>
-        </w:tc>
-        <w:tc>
-          <w:tcPr>
-            <w:tcW w:type="dxa" w:w="4394"/>
+                <w:sz w:val="18"/>
+                <w:szCs w:val="18"/>
+              </w:rPr>
+              <w:t xml:space="preserve">Gambar L.18.</w:t>
+            </w:r>
+            <w:r>
+              <w:rPr>
+                <w:rFonts w:ascii="Arial" w:cs="Arial" w:eastAsia="Arial" w:hAnsi="Arial"/>
+                <w:sz w:val="18"/>
+                <w:szCs w:val="18"/>
+              </w:rPr>
+              <w:t xml:space="preserve"> Formulir permohonan audiensi daring untuk masyarakat dan instansi</w:t>
+            </w:r>
+          </w:p>
+        </w:tc>
+        <w:tc>
+          <w:tcPr>
+            <w:tcW w:type="dxa" w:w="2929"/>
             <w:tcBorders>
               <w:top w:val="none" w:color="FFFFFF" w:sz="0"/>
               <w:left w:val="none" w:color="FFFFFF" w:sz="0"/>
@@ -21419,7 +22597,7 @@
             <w:r>
               <w:drawing>
                 <wp:inline distT="0" distB="0" distL="0" distR="0">
-                  <wp:extent cx="1905000" cy="4124325"/>
+                  <wp:extent cx="1714500" cy="3714750"/>
                   <wp:effectExtent t="0" r="0" b="0" l="0"/>
                   <wp:docPr id="1" name="" descr="" title=""/>
                   <wp:cNvGraphicFramePr>
@@ -21435,7 +22613,7 @@
                           </pic:cNvPicPr>
                         </pic:nvPicPr>
                         <pic:blipFill>
-                          <a:blip r:embed="rId16" cstate="none"/>
+                          <a:blip r:embed="rId30" cstate="none"/>
                           <a:srcRect/>
                           <a:stretch>
                             <a:fillRect/>
@@ -21444,7 +22622,7 @@
                         <pic:spPr bwMode="auto">
                           <a:xfrm>
                             <a:off x="0" y="0"/>
-                            <a:ext cx="1905000" cy="4124325"/>
+                            <a:ext cx="1714500" cy="3714750"/>
                           </a:xfrm>
                           <a:prstGeom prst="rect">
                             <a:avLst/>
@@ -21459,7 +22637,8 @@
           </w:p>
           <w:p>
             <w:pPr>
-              <w:spacing w:after="200" w:before="60"/>
+              <w:keepLines/>
+              <w:spacing w:after="220" w:before="60"/>
               <w:jc w:val="center"/>
             </w:pPr>
             <w:r>
@@ -21467,15 +22646,769 @@
                 <w:rFonts w:ascii="Arial" w:cs="Arial" w:eastAsia="Arial" w:hAnsi="Arial"/>
                 <w:b/>
                 <w:bCs/>
-                <w:sz w:val="20"/>
-                <w:szCs w:val="20"/>
-              </w:rPr>
-              <w:t xml:space="preserve">Gambar L.5. Halaman publik permohonan audiensi</w:t>
+                <w:sz w:val="18"/>
+                <w:szCs w:val="18"/>
+              </w:rPr>
+              <w:t xml:space="preserve">Gambar L.19.</w:t>
+            </w:r>
+            <w:r>
+              <w:rPr>
+                <w:rFonts w:ascii="Arial" w:cs="Arial" w:eastAsia="Arial" w:hAnsi="Arial"/>
+                <w:sz w:val="18"/>
+                <w:szCs w:val="18"/>
+              </w:rPr>
+              <w:t xml:space="preserve"> Kalender ketersediaan ruang rapat untuk umum, tanpa menampilkan identitas pemohon</w:t>
+            </w:r>
+          </w:p>
+        </w:tc>
+        <w:tc>
+          <w:tcPr>
+            <w:tcW w:type="dxa" w:w="2929"/>
+            <w:tcBorders>
+              <w:top w:val="none" w:color="FFFFFF" w:sz="0"/>
+              <w:left w:val="none" w:color="FFFFFF" w:sz="0"/>
+              <w:bottom w:val="none" w:color="FFFFFF" w:sz="0"/>
+              <w:right w:val="none" w:color="FFFFFF" w:sz="0"/>
+            </w:tcBorders>
+          </w:tcPr>
+          <w:p>
+            <w:pPr>
+              <w:spacing w:line="240" w:lineRule="auto"/>
+              <w:jc w:val="center"/>
+            </w:pPr>
+            <w:r>
+              <w:drawing>
+                <wp:inline distT="0" distB="0" distL="0" distR="0">
+                  <wp:extent cx="1714500" cy="3714750"/>
+                  <wp:effectExtent t="0" r="0" b="0" l="0"/>
+                  <wp:docPr id="1" name="" descr="" title=""/>
+                  <wp:cNvGraphicFramePr>
+                    <a:graphicFrameLocks xmlns:a="http://schemas.openxmlformats.org/drawingml/2006/main" noChangeAspect="1"/>
+                  </wp:cNvGraphicFramePr>
+                  <a:graphic xmlns:a="http://schemas.openxmlformats.org/drawingml/2006/main">
+                    <a:graphicData uri="http://schemas.openxmlformats.org/drawingml/2006/picture">
+                      <pic:pic xmlns:pic="http://schemas.openxmlformats.org/drawingml/2006/picture">
+                        <pic:nvPicPr>
+                          <pic:cNvPr id="0" name="" descr=""/>
+                          <pic:cNvPicPr>
+                            <a:picLocks noChangeAspect="1" noChangeArrowheads="1"/>
+                          </pic:cNvPicPr>
+                        </pic:nvPicPr>
+                        <pic:blipFill>
+                          <a:blip r:embed="rId31" cstate="none"/>
+                          <a:srcRect/>
+                          <a:stretch>
+                            <a:fillRect/>
+                          </a:stretch>
+                        </pic:blipFill>
+                        <pic:spPr bwMode="auto">
+                          <a:xfrm>
+                            <a:off x="0" y="0"/>
+                            <a:ext cx="1714500" cy="3714750"/>
+                          </a:xfrm>
+                          <a:prstGeom prst="rect">
+                            <a:avLst/>
+                          </a:prstGeom>
+                        </pic:spPr>
+                      </pic:pic>
+                    </a:graphicData>
+                  </a:graphic>
+                </wp:inline>
+              </w:drawing>
+            </w:r>
+          </w:p>
+          <w:p>
+            <w:pPr>
+              <w:keepLines/>
+              <w:spacing w:after="220" w:before="60"/>
+              <w:jc w:val="center"/>
+            </w:pPr>
+            <w:r>
+              <w:rPr>
+                <w:rFonts w:ascii="Arial" w:cs="Arial" w:eastAsia="Arial" w:hAnsi="Arial"/>
+                <w:b/>
+                <w:bCs/>
+                <w:sz w:val="18"/>
+                <w:szCs w:val="18"/>
+              </w:rPr>
+              <w:t xml:space="preserve">Gambar L.20.</w:t>
+            </w:r>
+            <w:r>
+              <w:rPr>
+                <w:rFonts w:ascii="Arial" w:cs="Arial" w:eastAsia="Arial" w:hAnsi="Arial"/>
+                <w:sz w:val="18"/>
+                <w:szCs w:val="18"/>
+              </w:rPr>
+              <w:t xml:space="preserve"> Daftar hadir digital melalui pindai kode QR, dengan tanda tangan di layar</w:t>
             </w:r>
           </w:p>
         </w:tc>
       </w:tr>
     </w:tbl>
+    <w:p>
+      <w:pPr>
+        <w:keepNext/>
+        <w:spacing w:after="0" w:line="240" w:lineRule="auto"/>
+        <w:jc w:val="center"/>
+      </w:pPr>
+      <w:r>
+        <w:drawing>
+          <wp:inline distT="0" distB="0" distL="0" distR="0">
+            <wp:extent cx="5048250" cy="3390900"/>
+            <wp:effectExtent t="0" r="0" b="0" l="0"/>
+            <wp:docPr id="1" name="" descr="" title=""/>
+            <wp:cNvGraphicFramePr>
+              <a:graphicFrameLocks xmlns:a="http://schemas.openxmlformats.org/drawingml/2006/main" noChangeAspect="1"/>
+            </wp:cNvGraphicFramePr>
+            <a:graphic xmlns:a="http://schemas.openxmlformats.org/drawingml/2006/main">
+              <a:graphicData uri="http://schemas.openxmlformats.org/drawingml/2006/picture">
+                <pic:pic xmlns:pic="http://schemas.openxmlformats.org/drawingml/2006/picture">
+                  <pic:nvPicPr>
+                    <pic:cNvPr id="0" name="" descr=""/>
+                    <pic:cNvPicPr>
+                      <a:picLocks noChangeAspect="1" noChangeArrowheads="1"/>
+                    </pic:cNvPicPr>
+                  </pic:nvPicPr>
+                  <pic:blipFill>
+                    <a:blip r:embed="rId32" cstate="none"/>
+                    <a:srcRect/>
+                    <a:stretch>
+                      <a:fillRect/>
+                    </a:stretch>
+                  </pic:blipFill>
+                  <pic:spPr bwMode="auto">
+                    <a:xfrm>
+                      <a:off x="0" y="0"/>
+                      <a:ext cx="5048250" cy="3390900"/>
+                    </a:xfrm>
+                    <a:prstGeom prst="rect">
+                      <a:avLst/>
+                    </a:prstGeom>
+                  </pic:spPr>
+                </pic:pic>
+              </a:graphicData>
+            </a:graphic>
+          </wp:inline>
+        </w:drawing>
+      </w:r>
+    </w:p>
+    <w:p>
+      <w:pPr>
+        <w:keepLines/>
+        <w:spacing w:after="220" w:before="60"/>
+        <w:jc w:val="center"/>
+      </w:pPr>
+      <w:r>
+        <w:rPr>
+          <w:rFonts w:ascii="Arial" w:cs="Arial" w:eastAsia="Arial" w:hAnsi="Arial"/>
+          <w:b/>
+          <w:bCs/>
+          <w:sz w:val="18"/>
+          <w:szCs w:val="18"/>
+        </w:rPr>
+        <w:t xml:space="preserve">Gambar L.21.</w:t>
+      </w:r>
+      <w:r>
+        <w:rPr>
+          <w:rFonts w:ascii="Arial" w:cs="Arial" w:eastAsia="Arial" w:hAnsi="Arial"/>
+          <w:sz w:val="18"/>
+          <w:szCs w:val="18"/>
+        </w:rPr>
+        <w:t xml:space="preserve"> Manajemen tamu: telaah berjenjang permohonan audiensi sampai menjadi agenda Pimpinan</w:t>
+      </w:r>
+    </w:p>
+    <w:p>
+      <w:pPr>
+        <w:keepNext/>
+        <w:spacing w:after="0" w:line="240" w:lineRule="auto"/>
+        <w:jc w:val="center"/>
+      </w:pPr>
+      <w:r>
+        <w:drawing>
+          <wp:inline distT="0" distB="0" distL="0" distR="0">
+            <wp:extent cx="5048250" cy="3390900"/>
+            <wp:effectExtent t="0" r="0" b="0" l="0"/>
+            <wp:docPr id="1" name="" descr="" title=""/>
+            <wp:cNvGraphicFramePr>
+              <a:graphicFrameLocks xmlns:a="http://schemas.openxmlformats.org/drawingml/2006/main" noChangeAspect="1"/>
+            </wp:cNvGraphicFramePr>
+            <a:graphic xmlns:a="http://schemas.openxmlformats.org/drawingml/2006/main">
+              <a:graphicData uri="http://schemas.openxmlformats.org/drawingml/2006/picture">
+                <pic:pic xmlns:pic="http://schemas.openxmlformats.org/drawingml/2006/picture">
+                  <pic:nvPicPr>
+                    <pic:cNvPr id="0" name="" descr=""/>
+                    <pic:cNvPicPr>
+                      <a:picLocks noChangeAspect="1" noChangeArrowheads="1"/>
+                    </pic:cNvPicPr>
+                  </pic:nvPicPr>
+                  <pic:blipFill>
+                    <a:blip r:embed="rId33" cstate="none"/>
+                    <a:srcRect/>
+                    <a:stretch>
+                      <a:fillRect/>
+                    </a:stretch>
+                  </pic:blipFill>
+                  <pic:spPr bwMode="auto">
+                    <a:xfrm>
+                      <a:off x="0" y="0"/>
+                      <a:ext cx="5048250" cy="3390900"/>
+                    </a:xfrm>
+                    <a:prstGeom prst="rect">
+                      <a:avLst/>
+                    </a:prstGeom>
+                  </pic:spPr>
+                </pic:pic>
+              </a:graphicData>
+            </a:graphic>
+          </wp:inline>
+        </w:drawing>
+      </w:r>
+    </w:p>
+    <w:p>
+      <w:pPr>
+        <w:keepLines/>
+        <w:spacing w:after="220" w:before="60"/>
+        <w:jc w:val="center"/>
+      </w:pPr>
+      <w:r>
+        <w:rPr>
+          <w:rFonts w:ascii="Arial" w:cs="Arial" w:eastAsia="Arial" w:hAnsi="Arial"/>
+          <w:b/>
+          <w:bCs/>
+          <w:sz w:val="18"/>
+          <w:szCs w:val="18"/>
+        </w:rPr>
+        <w:t xml:space="preserve">Gambar L.22.</w:t>
+      </w:r>
+      <w:r>
+        <w:rPr>
+          <w:rFonts w:ascii="Arial" w:cs="Arial" w:eastAsia="Arial" w:hAnsi="Arial"/>
+          <w:sz w:val="18"/>
+          <w:szCs w:val="18"/>
+        </w:rPr>
+        <w:t xml:space="preserve"> Dasbor peminjaman ruangan: pengajuan menunggu, permintaan batal, dan penanda pengajuan yang perlu segera diproses</w:t>
+      </w:r>
+    </w:p>
+    <w:p>
+      <w:pPr>
+        <w:keepNext/>
+        <w:spacing w:after="0" w:line="240" w:lineRule="auto"/>
+        <w:jc w:val="center"/>
+      </w:pPr>
+      <w:r>
+        <w:drawing>
+          <wp:inline distT="0" distB="0" distL="0" distR="0">
+            <wp:extent cx="5048250" cy="3390900"/>
+            <wp:effectExtent t="0" r="0" b="0" l="0"/>
+            <wp:docPr id="1" name="" descr="" title=""/>
+            <wp:cNvGraphicFramePr>
+              <a:graphicFrameLocks xmlns:a="http://schemas.openxmlformats.org/drawingml/2006/main" noChangeAspect="1"/>
+            </wp:cNvGraphicFramePr>
+            <a:graphic xmlns:a="http://schemas.openxmlformats.org/drawingml/2006/main">
+              <a:graphicData uri="http://schemas.openxmlformats.org/drawingml/2006/picture">
+                <pic:pic xmlns:pic="http://schemas.openxmlformats.org/drawingml/2006/picture">
+                  <pic:nvPicPr>
+                    <pic:cNvPr id="0" name="" descr=""/>
+                    <pic:cNvPicPr>
+                      <a:picLocks noChangeAspect="1" noChangeArrowheads="1"/>
+                    </pic:cNvPicPr>
+                  </pic:nvPicPr>
+                  <pic:blipFill>
+                    <a:blip r:embed="rId34" cstate="none"/>
+                    <a:srcRect/>
+                    <a:stretch>
+                      <a:fillRect/>
+                    </a:stretch>
+                  </pic:blipFill>
+                  <pic:spPr bwMode="auto">
+                    <a:xfrm>
+                      <a:off x="0" y="0"/>
+                      <a:ext cx="5048250" cy="3390900"/>
+                    </a:xfrm>
+                    <a:prstGeom prst="rect">
+                      <a:avLst/>
+                    </a:prstGeom>
+                  </pic:spPr>
+                </pic:pic>
+              </a:graphicData>
+            </a:graphic>
+          </wp:inline>
+        </w:drawing>
+      </w:r>
+    </w:p>
+    <w:p>
+      <w:pPr>
+        <w:keepLines/>
+        <w:spacing w:after="220" w:before="60"/>
+        <w:jc w:val="center"/>
+      </w:pPr>
+      <w:r>
+        <w:rPr>
+          <w:rFonts w:ascii="Arial" w:cs="Arial" w:eastAsia="Arial" w:hAnsi="Arial"/>
+          <w:b/>
+          <w:bCs/>
+          <w:sz w:val="18"/>
+          <w:szCs w:val="18"/>
+        </w:rPr>
+        <w:t xml:space="preserve">Gambar L.23.</w:t>
+      </w:r>
+      <w:r>
+        <w:rPr>
+          <w:rFonts w:ascii="Arial" w:cs="Arial" w:eastAsia="Arial" w:hAnsi="Arial"/>
+          <w:sz w:val="18"/>
+          <w:szCs w:val="18"/>
+        </w:rPr>
+        <w:t xml:space="preserve"> Kalender peminjaman Ruang Kenawai dan Imbaya untuk pengelola</w:t>
+      </w:r>
+    </w:p>
+    <w:p>
+      <w:pPr>
+        <w:keepNext/>
+        <w:spacing w:after="0" w:line="240" w:lineRule="auto"/>
+        <w:jc w:val="center"/>
+      </w:pPr>
+      <w:r>
+        <w:drawing>
+          <wp:inline distT="0" distB="0" distL="0" distR="0">
+            <wp:extent cx="5048250" cy="3390900"/>
+            <wp:effectExtent t="0" r="0" b="0" l="0"/>
+            <wp:docPr id="1" name="" descr="" title=""/>
+            <wp:cNvGraphicFramePr>
+              <a:graphicFrameLocks xmlns:a="http://schemas.openxmlformats.org/drawingml/2006/main" noChangeAspect="1"/>
+            </wp:cNvGraphicFramePr>
+            <a:graphic xmlns:a="http://schemas.openxmlformats.org/drawingml/2006/main">
+              <a:graphicData uri="http://schemas.openxmlformats.org/drawingml/2006/picture">
+                <pic:pic xmlns:pic="http://schemas.openxmlformats.org/drawingml/2006/picture">
+                  <pic:nvPicPr>
+                    <pic:cNvPr id="0" name="" descr=""/>
+                    <pic:cNvPicPr>
+                      <a:picLocks noChangeAspect="1" noChangeArrowheads="1"/>
+                    </pic:cNvPicPr>
+                  </pic:nvPicPr>
+                  <pic:blipFill>
+                    <a:blip r:embed="rId35" cstate="none"/>
+                    <a:srcRect/>
+                    <a:stretch>
+                      <a:fillRect/>
+                    </a:stretch>
+                  </pic:blipFill>
+                  <pic:spPr bwMode="auto">
+                    <a:xfrm>
+                      <a:off x="0" y="0"/>
+                      <a:ext cx="5048250" cy="3390900"/>
+                    </a:xfrm>
+                    <a:prstGeom prst="rect">
+                      <a:avLst/>
+                    </a:prstGeom>
+                  </pic:spPr>
+                </pic:pic>
+              </a:graphicData>
+            </a:graphic>
+          </wp:inline>
+        </w:drawing>
+      </w:r>
+    </w:p>
+    <w:p>
+      <w:pPr>
+        <w:keepLines/>
+        <w:spacing w:after="220" w:before="60"/>
+        <w:jc w:val="center"/>
+      </w:pPr>
+      <w:r>
+        <w:rPr>
+          <w:rFonts w:ascii="Arial" w:cs="Arial" w:eastAsia="Arial" w:hAnsi="Arial"/>
+          <w:b/>
+          <w:bCs/>
+          <w:sz w:val="18"/>
+          <w:szCs w:val="18"/>
+        </w:rPr>
+        <w:t xml:space="preserve">Gambar L.24.</w:t>
+      </w:r>
+      <w:r>
+        <w:rPr>
+          <w:rFonts w:ascii="Arial" w:cs="Arial" w:eastAsia="Arial" w:hAnsi="Arial"/>
+          <w:sz w:val="18"/>
+          <w:szCs w:val="18"/>
+        </w:rPr>
+        <w:t xml:space="preserve"> Pengelolaan acara daftar hadir: tautan, kode QR, buka-tutup otomatis, dan rekap di spreadsheet instansi</w:t>
+      </w:r>
+    </w:p>
+    <w:p>
+      <w:pPr>
+        <w:keepNext/>
+        <w:spacing w:after="120" w:before="120"/>
+      </w:pPr>
+      <w:r>
+        <w:rPr>
+          <w:rFonts w:ascii="Arial" w:cs="Arial" w:eastAsia="Arial" w:hAnsi="Arial"/>
+          <w:b/>
+          <w:bCs/>
+          <w:sz w:val="22"/>
+          <w:szCs w:val="22"/>
+        </w:rPr>
+        <w:t xml:space="preserve">F. Administrasi dan Integrasi</w:t>
+      </w:r>
+    </w:p>
+    <w:p>
+      <w:pPr>
+        <w:keepNext/>
+        <w:spacing w:after="0" w:line="240" w:lineRule="auto"/>
+        <w:jc w:val="center"/>
+      </w:pPr>
+      <w:r>
+        <w:drawing>
+          <wp:inline distT="0" distB="0" distL="0" distR="0">
+            <wp:extent cx="5048250" cy="3390900"/>
+            <wp:effectExtent t="0" r="0" b="0" l="0"/>
+            <wp:docPr id="1" name="" descr="" title=""/>
+            <wp:cNvGraphicFramePr>
+              <a:graphicFrameLocks xmlns:a="http://schemas.openxmlformats.org/drawingml/2006/main" noChangeAspect="1"/>
+            </wp:cNvGraphicFramePr>
+            <a:graphic xmlns:a="http://schemas.openxmlformats.org/drawingml/2006/main">
+              <a:graphicData uri="http://schemas.openxmlformats.org/drawingml/2006/picture">
+                <pic:pic xmlns:pic="http://schemas.openxmlformats.org/drawingml/2006/picture">
+                  <pic:nvPicPr>
+                    <pic:cNvPr id="0" name="" descr=""/>
+                    <pic:cNvPicPr>
+                      <a:picLocks noChangeAspect="1" noChangeArrowheads="1"/>
+                    </pic:cNvPicPr>
+                  </pic:nvPicPr>
+                  <pic:blipFill>
+                    <a:blip r:embed="rId36" cstate="none"/>
+                    <a:srcRect/>
+                    <a:stretch>
+                      <a:fillRect/>
+                    </a:stretch>
+                  </pic:blipFill>
+                  <pic:spPr bwMode="auto">
+                    <a:xfrm>
+                      <a:off x="0" y="0"/>
+                      <a:ext cx="5048250" cy="3390900"/>
+                    </a:xfrm>
+                    <a:prstGeom prst="rect">
+                      <a:avLst/>
+                    </a:prstGeom>
+                  </pic:spPr>
+                </pic:pic>
+              </a:graphicData>
+            </a:graphic>
+          </wp:inline>
+        </w:drawing>
+      </w:r>
+    </w:p>
+    <w:p>
+      <w:pPr>
+        <w:keepLines/>
+        <w:spacing w:after="220" w:before="60"/>
+        <w:jc w:val="center"/>
+      </w:pPr>
+      <w:r>
+        <w:rPr>
+          <w:rFonts w:ascii="Arial" w:cs="Arial" w:eastAsia="Arial" w:hAnsi="Arial"/>
+          <w:b/>
+          <w:bCs/>
+          <w:sz w:val="18"/>
+          <w:szCs w:val="18"/>
+        </w:rPr>
+        <w:t xml:space="preserve">Gambar L.25.</w:t>
+      </w:r>
+      <w:r>
+        <w:rPr>
+          <w:rFonts w:ascii="Arial" w:cs="Arial" w:eastAsia="Arial" w:hAnsi="Arial"/>
+          <w:sz w:val="18"/>
+          <w:szCs w:val="18"/>
+        </w:rPr>
+        <w:t xml:space="preserve"> Generator undangan siap tanda tangan elektronik Srikandi, dengan pratinjau PDF serta pemeriksaan dan pemesanan Ruang Imbaya dari formulir yang sama</w:t>
+      </w:r>
+    </w:p>
+    <w:p>
+      <w:pPr>
+        <w:keepNext/>
+        <w:spacing w:after="0" w:line="240" w:lineRule="auto"/>
+        <w:jc w:val="center"/>
+      </w:pPr>
+      <w:r>
+        <w:drawing>
+          <wp:inline distT="0" distB="0" distL="0" distR="0">
+            <wp:extent cx="5048250" cy="3390900"/>
+            <wp:effectExtent t="0" r="0" b="0" l="0"/>
+            <wp:docPr id="1" name="" descr="" title=""/>
+            <wp:cNvGraphicFramePr>
+              <a:graphicFrameLocks xmlns:a="http://schemas.openxmlformats.org/drawingml/2006/main" noChangeAspect="1"/>
+            </wp:cNvGraphicFramePr>
+            <a:graphic xmlns:a="http://schemas.openxmlformats.org/drawingml/2006/main">
+              <a:graphicData uri="http://schemas.openxmlformats.org/drawingml/2006/picture">
+                <pic:pic xmlns:pic="http://schemas.openxmlformats.org/drawingml/2006/picture">
+                  <pic:nvPicPr>
+                    <pic:cNvPr id="0" name="" descr=""/>
+                    <pic:cNvPicPr>
+                      <a:picLocks noChangeAspect="1" noChangeArrowheads="1"/>
+                    </pic:cNvPicPr>
+                  </pic:nvPicPr>
+                  <pic:blipFill>
+                    <a:blip r:embed="rId37" cstate="none"/>
+                    <a:srcRect/>
+                    <a:stretch>
+                      <a:fillRect/>
+                    </a:stretch>
+                  </pic:blipFill>
+                  <pic:spPr bwMode="auto">
+                    <a:xfrm>
+                      <a:off x="0" y="0"/>
+                      <a:ext cx="5048250" cy="3390900"/>
+                    </a:xfrm>
+                    <a:prstGeom prst="rect">
+                      <a:avLst/>
+                    </a:prstGeom>
+                  </pic:spPr>
+                </pic:pic>
+              </a:graphicData>
+            </a:graphic>
+          </wp:inline>
+        </w:drawing>
+      </w:r>
+    </w:p>
+    <w:p>
+      <w:pPr>
+        <w:keepLines/>
+        <w:spacing w:after="220" w:before="60"/>
+        <w:jc w:val="center"/>
+      </w:pPr>
+      <w:r>
+        <w:rPr>
+          <w:rFonts w:ascii="Arial" w:cs="Arial" w:eastAsia="Arial" w:hAnsi="Arial"/>
+          <w:b/>
+          <w:bCs/>
+          <w:sz w:val="18"/>
+          <w:szCs w:val="18"/>
+        </w:rPr>
+        <w:t xml:space="preserve">Gambar L.26.</w:t>
+      </w:r>
+      <w:r>
+        <w:rPr>
+          <w:rFonts w:ascii="Arial" w:cs="Arial" w:eastAsia="Arial" w:hAnsi="Arial"/>
+          <w:sz w:val="18"/>
+          <w:szCs w:val="18"/>
+        </w:rPr>
+        <w:t xml:space="preserve"> Pengaturan tampilan di Google Calendar bersama: agenda yang disetujui tampil otomatis dan dapat ditahan bila perlu</w:t>
+      </w:r>
+    </w:p>
+    <w:p>
+      <w:pPr>
+        <w:keepNext/>
+        <w:spacing w:after="0" w:line="240" w:lineRule="auto"/>
+        <w:jc w:val="center"/>
+      </w:pPr>
+      <w:r>
+        <w:drawing>
+          <wp:inline distT="0" distB="0" distL="0" distR="0">
+            <wp:extent cx="5048250" cy="3390900"/>
+            <wp:effectExtent t="0" r="0" b="0" l="0"/>
+            <wp:docPr id="1" name="" descr="" title=""/>
+            <wp:cNvGraphicFramePr>
+              <a:graphicFrameLocks xmlns:a="http://schemas.openxmlformats.org/drawingml/2006/main" noChangeAspect="1"/>
+            </wp:cNvGraphicFramePr>
+            <a:graphic xmlns:a="http://schemas.openxmlformats.org/drawingml/2006/main">
+              <a:graphicData uri="http://schemas.openxmlformats.org/drawingml/2006/picture">
+                <pic:pic xmlns:pic="http://schemas.openxmlformats.org/drawingml/2006/picture">
+                  <pic:nvPicPr>
+                    <pic:cNvPr id="0" name="" descr=""/>
+                    <pic:cNvPicPr>
+                      <a:picLocks noChangeAspect="1" noChangeArrowheads="1"/>
+                    </pic:cNvPicPr>
+                  </pic:nvPicPr>
+                  <pic:blipFill>
+                    <a:blip r:embed="rId38" cstate="none"/>
+                    <a:srcRect/>
+                    <a:stretch>
+                      <a:fillRect/>
+                    </a:stretch>
+                  </pic:blipFill>
+                  <pic:spPr bwMode="auto">
+                    <a:xfrm>
+                      <a:off x="0" y="0"/>
+                      <a:ext cx="5048250" cy="3390900"/>
+                    </a:xfrm>
+                    <a:prstGeom prst="rect">
+                      <a:avLst/>
+                    </a:prstGeom>
+                  </pic:spPr>
+                </pic:pic>
+              </a:graphicData>
+            </a:graphic>
+          </wp:inline>
+        </w:drawing>
+      </w:r>
+    </w:p>
+    <w:p>
+      <w:pPr>
+        <w:keepLines/>
+        <w:spacing w:after="220" w:before="60"/>
+        <w:jc w:val="center"/>
+      </w:pPr>
+      <w:r>
+        <w:rPr>
+          <w:rFonts w:ascii="Arial" w:cs="Arial" w:eastAsia="Arial" w:hAnsi="Arial"/>
+          <w:b/>
+          <w:bCs/>
+          <w:sz w:val="18"/>
+          <w:szCs w:val="18"/>
+        </w:rPr>
+        <w:t xml:space="preserve">Gambar L.27.</w:t>
+      </w:r>
+      <w:r>
+        <w:rPr>
+          <w:rFonts w:ascii="Arial" w:cs="Arial" w:eastAsia="Arial" w:hAnsi="Arial"/>
+          <w:sz w:val="18"/>
+          <w:szCs w:val="18"/>
+        </w:rPr>
+        <w:t xml:space="preserve"> Agenda kegiatan Pimpinan dengan sorotan hari ini, prakiraan cuaca, perkiraan waktu tempuh, dan kartu agenda yang dapat dibagikan</w:t>
+      </w:r>
+    </w:p>
+    <w:p>
+      <w:pPr>
+        <w:keepNext/>
+        <w:spacing w:after="0" w:line="240" w:lineRule="auto"/>
+        <w:jc w:val="center"/>
+      </w:pPr>
+      <w:r>
+        <w:drawing>
+          <wp:inline distT="0" distB="0" distL="0" distR="0">
+            <wp:extent cx="5048250" cy="3390900"/>
+            <wp:effectExtent t="0" r="0" b="0" l="0"/>
+            <wp:docPr id="1" name="" descr="" title=""/>
+            <wp:cNvGraphicFramePr>
+              <a:graphicFrameLocks xmlns:a="http://schemas.openxmlformats.org/drawingml/2006/main" noChangeAspect="1"/>
+            </wp:cNvGraphicFramePr>
+            <a:graphic xmlns:a="http://schemas.openxmlformats.org/drawingml/2006/main">
+              <a:graphicData uri="http://schemas.openxmlformats.org/drawingml/2006/picture">
+                <pic:pic xmlns:pic="http://schemas.openxmlformats.org/drawingml/2006/picture">
+                  <pic:nvPicPr>
+                    <pic:cNvPr id="0" name="" descr=""/>
+                    <pic:cNvPicPr>
+                      <a:picLocks noChangeAspect="1" noChangeArrowheads="1"/>
+                    </pic:cNvPicPr>
+                  </pic:nvPicPr>
+                  <pic:blipFill>
+                    <a:blip r:embed="rId39" cstate="none"/>
+                    <a:srcRect/>
+                    <a:stretch>
+                      <a:fillRect/>
+                    </a:stretch>
+                  </pic:blipFill>
+                  <pic:spPr bwMode="auto">
+                    <a:xfrm>
+                      <a:off x="0" y="0"/>
+                      <a:ext cx="5048250" cy="3390900"/>
+                    </a:xfrm>
+                    <a:prstGeom prst="rect">
+                      <a:avLst/>
+                    </a:prstGeom>
+                  </pic:spPr>
+                </pic:pic>
+              </a:graphicData>
+            </a:graphic>
+          </wp:inline>
+        </w:drawing>
+      </w:r>
+    </w:p>
+    <w:p>
+      <w:pPr>
+        <w:keepLines/>
+        <w:spacing w:after="220" w:before="60"/>
+        <w:jc w:val="center"/>
+      </w:pPr>
+      <w:r>
+        <w:rPr>
+          <w:rFonts w:ascii="Arial" w:cs="Arial" w:eastAsia="Arial" w:hAnsi="Arial"/>
+          <w:b/>
+          <w:bCs/>
+          <w:sz w:val="18"/>
+          <w:szCs w:val="18"/>
+        </w:rPr>
+        <w:t xml:space="preserve">Gambar L.28.</w:t>
+      </w:r>
+      <w:r>
+        <w:rPr>
+          <w:rFonts w:ascii="Arial" w:cs="Arial" w:eastAsia="Arial" w:hAnsi="Arial"/>
+          <w:sz w:val="18"/>
+          <w:szCs w:val="18"/>
+        </w:rPr>
+        <w:t xml:space="preserve"> Rekap agenda harian siap kirim melalui WhatsApp</w:t>
+      </w:r>
+    </w:p>
+    <w:p>
+      <w:pPr>
+        <w:keepNext/>
+        <w:spacing w:after="0" w:line="240" w:lineRule="auto"/>
+        <w:jc w:val="center"/>
+      </w:pPr>
+      <w:r>
+        <w:drawing>
+          <wp:inline distT="0" distB="0" distL="0" distR="0">
+            <wp:extent cx="5048250" cy="3390900"/>
+            <wp:effectExtent t="0" r="0" b="0" l="0"/>
+            <wp:docPr id="1" name="" descr="" title=""/>
+            <wp:cNvGraphicFramePr>
+              <a:graphicFrameLocks xmlns:a="http://schemas.openxmlformats.org/drawingml/2006/main" noChangeAspect="1"/>
+            </wp:cNvGraphicFramePr>
+            <a:graphic xmlns:a="http://schemas.openxmlformats.org/drawingml/2006/main">
+              <a:graphicData uri="http://schemas.openxmlformats.org/drawingml/2006/picture">
+                <pic:pic xmlns:pic="http://schemas.openxmlformats.org/drawingml/2006/picture">
+                  <pic:nvPicPr>
+                    <pic:cNvPr id="0" name="" descr=""/>
+                    <pic:cNvPicPr>
+                      <a:picLocks noChangeAspect="1" noChangeArrowheads="1"/>
+                    </pic:cNvPicPr>
+                  </pic:nvPicPr>
+                  <pic:blipFill>
+                    <a:blip r:embed="rId40" cstate="none"/>
+                    <a:srcRect/>
+                    <a:stretch>
+                      <a:fillRect/>
+                    </a:stretch>
+                  </pic:blipFill>
+                  <pic:spPr bwMode="auto">
+                    <a:xfrm>
+                      <a:off x="0" y="0"/>
+                      <a:ext cx="5048250" cy="3390900"/>
+                    </a:xfrm>
+                    <a:prstGeom prst="rect">
+                      <a:avLst/>
+                    </a:prstGeom>
+                  </pic:spPr>
+                </pic:pic>
+              </a:graphicData>
+            </a:graphic>
+          </wp:inline>
+        </w:drawing>
+      </w:r>
+    </w:p>
+    <w:p>
+      <w:pPr>
+        <w:keepLines/>
+        <w:spacing w:after="220" w:before="60"/>
+        <w:jc w:val="center"/>
+      </w:pPr>
+      <w:r>
+        <w:rPr>
+          <w:rFonts w:ascii="Arial" w:cs="Arial" w:eastAsia="Arial" w:hAnsi="Arial"/>
+          <w:b/>
+          <w:bCs/>
+          <w:sz w:val="18"/>
+          <w:szCs w:val="18"/>
+        </w:rPr>
+        <w:t xml:space="preserve">Gambar L.29.</w:t>
+      </w:r>
+      <w:r>
+        <w:rPr>
+          <w:rFonts w:ascii="Arial" w:cs="Arial" w:eastAsia="Arial" w:hAnsi="Arial"/>
+          <w:sz w:val="18"/>
+          <w:szCs w:val="18"/>
+        </w:rPr>
+        <w:t xml:space="preserve"> Laporan mingguan dan bulanan kegiatan Pimpinan, siap cetak</w:t>
+      </w:r>
+    </w:p>
     <w:p>
       <w:r>
         <w:br w:type="page"/>

</xml_diff>

<commit_message>
Proposal Tarakan: Darwis diganti Juliyanti, S.AP. (Kasubbag Komdokpim)
Urutan tim mengikuti jenjang jabatan: Anugrah (Ketua), Saifullah,
Juliyanti, Pebriadi Banne, Nuraini Wiliadewi. Berlaku pada sampul, tabel
tim, surat usulan Sekda, teks isian RISDA, dan Lampiran 3. PDF pratinjau
surat usulan kini ikut dibuat ulang oleh npm run buat:tarakan.

Co-Authored-By: Claude Opus 5.5 <noreply@anthropic.com>
Claude-Session: https://claude.ai/code/session_01TchDZWsQsgeuq52sKmozd1
</commit_message>
<xml_diff>
--- a/docs/lomba/tarakan/Proposal-Tarakan-Prokopim-Hibot.docx
+++ b/docs/lomba/tarakan/Proposal-Tarakan-Prokopim-Hibot.docx
@@ -223,7 +223,7 @@
           <w:sz w:val="22"/>
           <w:szCs w:val="22"/>
         </w:rPr>
-        <w:t xml:space="preserve">Pebriadi Banne, S.IP. (Anggota)</w:t>
+        <w:t xml:space="preserve">Juliyanti, S.AP. (Anggota)</w:t>
       </w:r>
     </w:p>
     <w:p>
@@ -239,7 +239,7 @@
           <w:sz w:val="22"/>
           <w:szCs w:val="22"/>
         </w:rPr>
-        <w:t xml:space="preserve">Nuraini Wiliadewi, S.IP. (Anggota)</w:t>
+        <w:t xml:space="preserve">Pebriadi Banne, S.IP. (Anggota)</w:t>
       </w:r>
     </w:p>
     <w:p>
@@ -255,7 +255,7 @@
           <w:sz w:val="22"/>
           <w:szCs w:val="22"/>
         </w:rPr>
-        <w:t xml:space="preserve">Darwis, S.T. (Anggota)</w:t>
+        <w:t xml:space="preserve">Nuraini Wiliadewi, S.IP. (Anggota)</w:t>
       </w:r>
     </w:p>
     <w:p>
@@ -2753,21 +2753,21 @@
                 <w:sz w:val="20"/>
                 <w:szCs w:val="20"/>
               </w:rPr>
-              <w:t xml:space="preserve">Pebriadi Banne, S.IP.</w:t>
-            </w:r>
-          </w:p>
-          <w:p>
-            <w:pPr>
-              <w:spacing w:after="0" w:line="240" w:lineRule="auto"/>
-              <w:jc w:val="left"/>
-            </w:pPr>
-            <w:r>
-              <w:rPr>
-                <w:rFonts w:ascii="Arial" w:cs="Arial" w:eastAsia="Arial" w:hAnsi="Arial"/>
-                <w:sz w:val="20"/>
-                <w:szCs w:val="20"/>
-              </w:rPr>
-              <w:t xml:space="preserve">Pengelola Layanan Operasional</w:t>
+              <w:t xml:space="preserve">Juliyanti, S.AP.</w:t>
+            </w:r>
+          </w:p>
+          <w:p>
+            <w:pPr>
+              <w:spacing w:after="0" w:line="240" w:lineRule="auto"/>
+              <w:jc w:val="left"/>
+            </w:pPr>
+            <w:r>
+              <w:rPr>
+                <w:rFonts w:ascii="Arial" w:cs="Arial" w:eastAsia="Arial" w:hAnsi="Arial"/>
+                <w:sz w:val="20"/>
+                <w:szCs w:val="20"/>
+              </w:rPr>
+              <w:t xml:space="preserve">Kepala Sub Bagian Komunikasi dan Dokumentasi Pimpinan</w:t>
             </w:r>
           </w:p>
         </w:tc>
@@ -2831,7 +2831,7 @@
                 <w:sz w:val="20"/>
                 <w:szCs w:val="20"/>
               </w:rPr>
-              <w:t xml:space="preserve">Pelaksana dan penguji di lapangan; penghimpun kendala pemakaian sehari-hari</w:t>
+              <w:t xml:space="preserve">Penyelia penerapan pada alur komunikasi dan dokumentasi; penguji; pemberi pertimbangan rancangan</w:t>
             </w:r>
           </w:p>
         </w:tc>
@@ -2903,21 +2903,21 @@
                 <w:sz w:val="20"/>
                 <w:szCs w:val="20"/>
               </w:rPr>
-              <w:t xml:space="preserve">Nuraini Wiliadewi, S.IP.</w:t>
-            </w:r>
-          </w:p>
-          <w:p>
-            <w:pPr>
-              <w:spacing w:after="0" w:line="240" w:lineRule="auto"/>
-              <w:jc w:val="left"/>
-            </w:pPr>
-            <w:r>
-              <w:rPr>
-                <w:rFonts w:ascii="Arial" w:cs="Arial" w:eastAsia="Arial" w:hAnsi="Arial"/>
-                <w:sz w:val="20"/>
-                <w:szCs w:val="20"/>
-              </w:rPr>
-              <w:t xml:space="preserve">Penelaah Teknis Kebijakan</w:t>
+              <w:t xml:space="preserve">Pebriadi Banne, S.IP.</w:t>
+            </w:r>
+          </w:p>
+          <w:p>
+            <w:pPr>
+              <w:spacing w:after="0" w:line="240" w:lineRule="auto"/>
+              <w:jc w:val="left"/>
+            </w:pPr>
+            <w:r>
+              <w:rPr>
+                <w:rFonts w:ascii="Arial" w:cs="Arial" w:eastAsia="Arial" w:hAnsi="Arial"/>
+                <w:sz w:val="20"/>
+                <w:szCs w:val="20"/>
+              </w:rPr>
+              <w:t xml:space="preserve">Pengelola Layanan Operasional</w:t>
             </w:r>
           </w:p>
         </w:tc>
@@ -3053,7 +3053,7 @@
                 <w:sz w:val="20"/>
                 <w:szCs w:val="20"/>
               </w:rPr>
-              <w:t xml:space="preserve">Darwis, S.T.</w:t>
+              <w:t xml:space="preserve">Nuraini Wiliadewi, S.IP.</w:t>
             </w:r>
           </w:p>
           <w:p>

</xml_diff>

<commit_message>
Proposal Tarakan: sampul, pakta, dan surat usulan persis format Petunjuk Teknis Kota
- Sampul (Lampiran 1): kepala tebal, judul tebal oranye, baris lain huruf biasa.
- Pakta (Lampiran 2): label "Instansi/sekolah/perguruan tinggi/komunitas" dan
  "Judul inovasi/gagasan", kalimat pernyataan apa adanya ("Inovasi atau
  gagasan", "Saya/kami"), Dibuat di/Tanggal sebaris, tanda tangan rata kiri
  dengan nama dalam kurung, tanpa jabatan dan NIP.
- Surat usulan (Lampiran 3): No/Lampiran/Hal tanpa Sifat, tujuan satu baris
  "Yth. Kepala Bappeda Litbang Kota Tarakan" lalu di/Tarakan, "Dengan
  hormat,", nama lomba dan label identitas usulan bercetak tebal.

Co-Authored-By: Claude Opus 5.5 <noreply@anthropic.com>
Claude-Session: https://claude.ai/code/session_01TchDZWsQsgeuq52sKmozd1
</commit_message>
<xml_diff>
--- a/docs/lomba/tarakan/Proposal-Tarakan-Prokopim-Hibot.docx
+++ b/docs/lomba/tarakan/Proposal-Tarakan-Prokopim-Hibot.docx
@@ -4,7 +4,7 @@
   <w:body>
     <w:p>
       <w:pPr>
-        <w:spacing w:after="60" w:before="0" w:line="276" w:lineRule="auto"/>
+        <w:spacing w:after="40" w:before="0" w:line="276" w:lineRule="auto"/>
         <w:jc w:val="center"/>
       </w:pPr>
       <w:r>
@@ -20,7 +20,7 @@
     </w:p>
     <w:p>
       <w:pPr>
-        <w:spacing w:after="60" w:before="0" w:line="276" w:lineRule="auto"/>
+        <w:spacing w:after="40" w:before="0" w:line="276" w:lineRule="auto"/>
         <w:jc w:val="center"/>
       </w:pPr>
       <w:r>
@@ -28,15 +28,15 @@
           <w:rFonts w:ascii="Arial" w:cs="Arial" w:eastAsia="Arial" w:hAnsi="Arial"/>
           <w:b/>
           <w:bCs/>
-          <w:sz w:val="28"/>
-          <w:szCs w:val="28"/>
+          <w:sz w:val="32"/>
+          <w:szCs w:val="32"/>
         </w:rPr>
         <w:t xml:space="preserve">LOMBA INOVASI DAERAH KOTA TARAKAN</w:t>
       </w:r>
     </w:p>
     <w:p>
       <w:pPr>
-        <w:spacing w:after="520" w:before="0" w:line="276" w:lineRule="auto"/>
+        <w:spacing w:after="480" w:before="0" w:line="276" w:lineRule="auto"/>
         <w:jc w:val="center"/>
       </w:pPr>
       <w:r>
@@ -44,15 +44,15 @@
           <w:rFonts w:ascii="Arial" w:cs="Arial" w:eastAsia="Arial" w:hAnsi="Arial"/>
           <w:b/>
           <w:bCs/>
-          <w:sz w:val="28"/>
-          <w:szCs w:val="28"/>
+          <w:sz w:val="32"/>
+          <w:szCs w:val="32"/>
         </w:rPr>
         <w:t xml:space="preserve">TAHUN 2026</w:t>
       </w:r>
     </w:p>
     <w:p>
       <w:pPr>
-        <w:spacing w:after="520" w:line="240" w:lineRule="auto"/>
+        <w:spacing w:after="480" w:line="240" w:lineRule="auto"/>
         <w:jc w:val="center"/>
       </w:pPr>
       <w:r>
@@ -98,7 +98,7 @@
     </w:p>
     <w:p>
       <w:pPr>
-        <w:spacing w:after="100" w:before="0" w:line="276" w:lineRule="auto"/>
+        <w:spacing w:after="60" w:before="0" w:line="276" w:lineRule="auto"/>
         <w:jc w:val="center"/>
       </w:pPr>
       <w:r>
@@ -106,8 +106,9 @@
           <w:rFonts w:ascii="Arial" w:cs="Arial" w:eastAsia="Arial" w:hAnsi="Arial"/>
           <w:b/>
           <w:bCs/>
-          <w:sz w:val="40"/>
-          <w:szCs w:val="40"/>
+          <w:color w:val="E8862A"/>
+          <w:sz w:val="36"/>
+          <w:szCs w:val="36"/>
         </w:rPr>
         <w:t xml:space="preserve">PROKOPIM HIBOT</w:t>
       </w:r>
@@ -115,7 +116,7 @@
     <w:p>
       <w:pPr>
         <w:spacing w:after="440" w:before="0" w:line="300" w:lineRule="auto"/>
-        <w:ind w:left="500" w:right="500"/>
+        <w:ind w:left="400" w:right="400"/>
         <w:jc w:val="center"/>
       </w:pPr>
       <w:r>
@@ -123,22 +124,23 @@
           <w:rFonts w:ascii="Arial" w:cs="Arial" w:eastAsia="Arial" w:hAnsi="Arial"/>
           <w:b/>
           <w:bCs/>
-          <w:sz w:val="26"/>
-          <w:szCs w:val="26"/>
+          <w:color w:val="E8862A"/>
+          <w:sz w:val="28"/>
+          <w:szCs w:val="28"/>
         </w:rPr>
         <w:t xml:space="preserve">Superapp Pelayanan Keprotokolan dan Komunikasi Pimpinan Pemerintah Kota Tarakan</w:t>
       </w:r>
     </w:p>
     <w:p>
       <w:pPr>
-        <w:spacing w:after="80" w:before="0" w:line="276" w:lineRule="auto"/>
+        <w:spacing w:after="60" w:before="0" w:line="276" w:lineRule="auto"/>
         <w:jc w:val="center"/>
       </w:pPr>
       <w:r>
         <w:rPr>
           <w:rFonts w:ascii="Arial" w:cs="Arial" w:eastAsia="Arial" w:hAnsi="Arial"/>
-          <w:b/>
-          <w:bCs/>
+          <w:b w:val="false"/>
+          <w:bCs w:val="false"/>
           <w:sz w:val="24"/>
           <w:szCs w:val="24"/>
         </w:rPr>
@@ -147,7 +149,7 @@
     </w:p>
     <w:p>
       <w:pPr>
-        <w:spacing w:after="440" w:before="0" w:line="276" w:lineRule="auto"/>
+        <w:spacing w:after="560" w:before="0" w:line="276" w:lineRule="auto"/>
         <w:ind w:left="500" w:right="500"/>
         <w:jc w:val="center"/>
       </w:pPr>
@@ -164,14 +166,14 @@
     </w:p>
     <w:p>
       <w:pPr>
-        <w:spacing w:after="80" w:before="0" w:line="276" w:lineRule="auto"/>
+        <w:spacing w:after="60" w:before="0" w:line="276" w:lineRule="auto"/>
         <w:jc w:val="center"/>
       </w:pPr>
       <w:r>
         <w:rPr>
           <w:rFonts w:ascii="Arial" w:cs="Arial" w:eastAsia="Arial" w:hAnsi="Arial"/>
-          <w:b/>
-          <w:bCs/>
+          <w:b w:val="false"/>
+          <w:bCs w:val="false"/>
           <w:sz w:val="24"/>
           <w:szCs w:val="24"/>
         </w:rPr>
@@ -266,8 +268,8 @@
       <w:r>
         <w:rPr>
           <w:rFonts w:ascii="Arial" w:cs="Arial" w:eastAsia="Arial" w:hAnsi="Arial"/>
-          <w:b/>
-          <w:bCs/>
+          <w:b w:val="false"/>
+          <w:bCs w:val="false"/>
           <w:sz w:val="24"/>
           <w:szCs w:val="24"/>
         </w:rPr>
@@ -282,8 +284,8 @@
       <w:r>
         <w:rPr>
           <w:rFonts w:ascii="Arial" w:cs="Arial" w:eastAsia="Arial" w:hAnsi="Arial"/>
-          <w:b/>
-          <w:bCs/>
+          <w:b w:val="false"/>
+          <w:bCs w:val="false"/>
           <w:sz w:val="24"/>
           <w:szCs w:val="24"/>
         </w:rPr>
@@ -292,16 +294,16 @@
     </w:p>
     <w:p>
       <w:pPr>
-        <w:spacing w:after="0" w:before="700" w:line="276" w:lineRule="auto"/>
+        <w:spacing w:after="0" w:before="640" w:line="276" w:lineRule="auto"/>
         <w:jc w:val="center"/>
       </w:pPr>
       <w:r>
         <w:rPr>
           <w:rFonts w:ascii="Arial" w:cs="Arial" w:eastAsia="Arial" w:hAnsi="Arial"/>
-          <w:b/>
-          <w:bCs/>
-          <w:sz w:val="26"/>
-          <w:szCs w:val="26"/>
+          <w:b w:val="false"/>
+          <w:bCs w:val="false"/>
+          <w:sz w:val="24"/>
+          <w:szCs w:val="24"/>
         </w:rPr>
         <w:t xml:space="preserve">KOTA TARAKAN</w:t>
       </w:r>
@@ -314,10 +316,10 @@
       <w:r>
         <w:rPr>
           <w:rFonts w:ascii="Arial" w:cs="Arial" w:eastAsia="Arial" w:hAnsi="Arial"/>
-          <w:b/>
-          <w:bCs/>
-          <w:sz w:val="26"/>
-          <w:szCs w:val="26"/>
+          <w:b w:val="false"/>
+          <w:bCs w:val="false"/>
+          <w:sz w:val="24"/>
+          <w:szCs w:val="24"/>
         </w:rPr>
         <w:t xml:space="preserve">TAHUN 2026</w:t>
       </w:r>
@@ -19628,7 +19630,6 @@
           <w:bCs/>
           <w:sz w:val="24"/>
           <w:szCs w:val="24"/>
-          <w:u w:val="single"/>
         </w:rPr>
         <w:t xml:space="preserve">PAKTA INTEGRITAS</w:t>
       </w:r>
@@ -19646,14 +19647,14 @@
         </w:tblBorders>
       </w:tblPr>
       <w:tblGrid>
-        <w:gridCol w:w="2460"/>
+        <w:gridCol w:w="3032"/>
         <w:gridCol w:w="250"/>
-        <w:gridCol w:w="6077"/>
+        <w:gridCol w:w="5505"/>
       </w:tblGrid>
       <w:tr>
         <w:tc>
           <w:tcPr>
-            <w:tcW w:type="dxa" w:w="2460"/>
+            <w:tcW w:type="dxa" w:w="3032"/>
             <w:tcBorders>
               <w:top w:val="none" w:color="FFFFFF" w:sz="0"/>
               <w:left w:val="none" w:color="FFFFFF" w:sz="0"/>
@@ -19717,7 +19718,7 @@
         </w:tc>
         <w:tc>
           <w:tcPr>
-            <w:tcW w:type="dxa" w:w="6077"/>
+            <w:tcW w:type="dxa" w:w="5505"/>
             <w:tcBorders>
               <w:top w:val="none" w:color="FFFFFF" w:sz="0"/>
               <w:left w:val="none" w:color="FFFFFF" w:sz="0"/>
@@ -19751,7 +19752,7 @@
       <w:tr>
         <w:tc>
           <w:tcPr>
-            <w:tcW w:type="dxa" w:w="2460"/>
+            <w:tcW w:type="dxa" w:w="3032"/>
             <w:tcBorders>
               <w:top w:val="none" w:color="FFFFFF" w:sz="0"/>
               <w:left w:val="none" w:color="FFFFFF" w:sz="0"/>
@@ -19815,7 +19816,7 @@
         </w:tc>
         <w:tc>
           <w:tcPr>
-            <w:tcW w:type="dxa" w:w="6077"/>
+            <w:tcW w:type="dxa" w:w="5505"/>
             <w:tcBorders>
               <w:top w:val="none" w:color="FFFFFF" w:sz="0"/>
               <w:left w:val="none" w:color="FFFFFF" w:sz="0"/>
@@ -19851,7 +19852,7 @@
       <w:tr>
         <w:tc>
           <w:tcPr>
-            <w:tcW w:type="dxa" w:w="2460"/>
+            <w:tcW w:type="dxa" w:w="3032"/>
             <w:tcBorders>
               <w:top w:val="none" w:color="FFFFFF" w:sz="0"/>
               <w:left w:val="none" w:color="FFFFFF" w:sz="0"/>
@@ -19915,7 +19916,7 @@
         </w:tc>
         <w:tc>
           <w:tcPr>
-            <w:tcW w:type="dxa" w:w="6077"/>
+            <w:tcW w:type="dxa" w:w="5505"/>
             <w:tcBorders>
               <w:top w:val="none" w:color="FFFFFF" w:sz="0"/>
               <w:left w:val="none" w:color="FFFFFF" w:sz="0"/>
@@ -19951,7 +19952,7 @@
       <w:tr>
         <w:tc>
           <w:tcPr>
-            <w:tcW w:type="dxa" w:w="2460"/>
+            <w:tcW w:type="dxa" w:w="3032"/>
             <w:tcBorders>
               <w:top w:val="none" w:color="FFFFFF" w:sz="0"/>
               <w:left w:val="none" w:color="FFFFFF" w:sz="0"/>
@@ -19977,7 +19978,21 @@
                 <w:sz w:val="22"/>
                 <w:szCs w:val="22"/>
               </w:rPr>
-              <w:t xml:space="preserve">Instansi</w:t>
+              <w:t xml:space="preserve">Instansi/sekolah/</w:t>
+            </w:r>
+          </w:p>
+          <w:p>
+            <w:pPr>
+              <w:spacing w:after="0" w:line="240" w:lineRule="auto"/>
+              <w:jc w:val="left"/>
+            </w:pPr>
+            <w:r>
+              <w:rPr>
+                <w:rFonts w:ascii="Arial" w:cs="Arial" w:eastAsia="Arial" w:hAnsi="Arial"/>
+                <w:sz w:val="22"/>
+                <w:szCs w:val="22"/>
+              </w:rPr>
+              <w:t xml:space="preserve">perguruan tinggi/komunitas</w:t>
             </w:r>
           </w:p>
         </w:tc>
@@ -20015,7 +20030,7 @@
         </w:tc>
         <w:tc>
           <w:tcPr>
-            <w:tcW w:type="dxa" w:w="6077"/>
+            <w:tcW w:type="dxa" w:w="5505"/>
             <w:tcBorders>
               <w:top w:val="none" w:color="FFFFFF" w:sz="0"/>
               <w:left w:val="none" w:color="FFFFFF" w:sz="0"/>
@@ -20049,7 +20064,7 @@
       <w:tr>
         <w:tc>
           <w:tcPr>
-            <w:tcW w:type="dxa" w:w="2460"/>
+            <w:tcW w:type="dxa" w:w="3032"/>
             <w:tcBorders>
               <w:top w:val="none" w:color="FFFFFF" w:sz="0"/>
               <w:left w:val="none" w:color="FFFFFF" w:sz="0"/>
@@ -20113,7 +20128,7 @@
         </w:tc>
         <w:tc>
           <w:tcPr>
-            <w:tcW w:type="dxa" w:w="6077"/>
+            <w:tcW w:type="dxa" w:w="5505"/>
             <w:tcBorders>
               <w:top w:val="none" w:color="FFFFFF" w:sz="0"/>
               <w:left w:val="none" w:color="FFFFFF" w:sz="0"/>
@@ -20147,7 +20162,7 @@
       <w:tr>
         <w:tc>
           <w:tcPr>
-            <w:tcW w:type="dxa" w:w="2460"/>
+            <w:tcW w:type="dxa" w:w="3032"/>
             <w:tcBorders>
               <w:top w:val="none" w:color="FFFFFF" w:sz="0"/>
               <w:left w:val="none" w:color="FFFFFF" w:sz="0"/>
@@ -20211,7 +20226,7 @@
         </w:tc>
         <w:tc>
           <w:tcPr>
-            <w:tcW w:type="dxa" w:w="6077"/>
+            <w:tcW w:type="dxa" w:w="5505"/>
             <w:tcBorders>
               <w:top w:val="none" w:color="FFFFFF" w:sz="0"/>
               <w:left w:val="none" w:color="FFFFFF" w:sz="0"/>
@@ -20245,7 +20260,7 @@
       <w:tr>
         <w:tc>
           <w:tcPr>
-            <w:tcW w:type="dxa" w:w="2460"/>
+            <w:tcW w:type="dxa" w:w="3032"/>
             <w:tcBorders>
               <w:top w:val="none" w:color="FFFFFF" w:sz="0"/>
               <w:left w:val="none" w:color="FFFFFF" w:sz="0"/>
@@ -20309,7 +20324,7 @@
         </w:tc>
         <w:tc>
           <w:tcPr>
-            <w:tcW w:type="dxa" w:w="6077"/>
+            <w:tcW w:type="dxa" w:w="5505"/>
             <w:tcBorders>
               <w:top w:val="none" w:color="FFFFFF" w:sz="0"/>
               <w:left w:val="none" w:color="FFFFFF" w:sz="0"/>
@@ -20345,7 +20360,7 @@
       <w:tr>
         <w:tc>
           <w:tcPr>
-            <w:tcW w:type="dxa" w:w="2460"/>
+            <w:tcW w:type="dxa" w:w="3032"/>
             <w:tcBorders>
               <w:top w:val="none" w:color="FFFFFF" w:sz="0"/>
               <w:left w:val="none" w:color="FFFFFF" w:sz="0"/>
@@ -20371,7 +20386,7 @@
                 <w:sz w:val="22"/>
                 <w:szCs w:val="22"/>
               </w:rPr>
-              <w:t xml:space="preserve">Judul inovasi</w:t>
+              <w:t xml:space="preserve">Judul inovasi/gagasan</w:t>
             </w:r>
           </w:p>
         </w:tc>
@@ -20409,7 +20424,7 @@
         </w:tc>
         <w:tc>
           <w:tcPr>
-            <w:tcW w:type="dxa" w:w="6077"/>
+            <w:tcW w:type="dxa" w:w="5505"/>
             <w:tcBorders>
               <w:top w:val="none" w:color="FFFFFF" w:sz="0"/>
               <w:left w:val="none" w:color="FFFFFF" w:sz="0"/>
@@ -20443,7 +20458,7 @@
       <w:tr>
         <w:tc>
           <w:tcPr>
-            <w:tcW w:type="dxa" w:w="2460"/>
+            <w:tcW w:type="dxa" w:w="3032"/>
             <w:tcBorders>
               <w:top w:val="none" w:color="FFFFFF" w:sz="0"/>
               <w:left w:val="none" w:color="FFFFFF" w:sz="0"/>
@@ -20507,7 +20522,7 @@
         </w:tc>
         <w:tc>
           <w:tcPr>
-            <w:tcW w:type="dxa" w:w="6077"/>
+            <w:tcW w:type="dxa" w:w="5505"/>
             <w:tcBorders>
               <w:top w:val="none" w:color="FFFFFF" w:sz="0"/>
               <w:left w:val="none" w:color="FFFFFF" w:sz="0"/>
@@ -20541,7 +20556,7 @@
     </w:tbl>
     <w:p>
       <w:pPr>
-        <w:spacing w:after="100" w:before="120" w:line="276" w:lineRule="auto"/>
+        <w:spacing w:after="100" w:before="240" w:line="276" w:lineRule="auto"/>
         <w:jc w:val="both"/>
       </w:pPr>
       <w:r>
@@ -20588,7 +20603,7 @@
           <w:sz w:val="22"/>
           <w:szCs w:val="22"/>
         </w:rPr>
-        <w:t xml:space="preserve">Inovasi merupakan karya asli dan tidak melanggar hak kekayaan intelektual pihak lain.</w:t>
+        <w:t xml:space="preserve">Inovasi atau gagasan merupakan karya asli dan tidak melanggar hak kekayaan intelektual pihak lain.</w:t>
       </w:r>
     </w:p>
     <w:p>
@@ -20626,7 +20641,7 @@
           <w:sz w:val="22"/>
           <w:szCs w:val="22"/>
         </w:rPr>
-        <w:t xml:space="preserve">Kami bersedia mengikuti seluruh tahapan penilaian, memberikan klarifikasi, dan menerima verifikasi.</w:t>
+        <w:t xml:space="preserve">Saya/kami bersedia mengikuti seluruh tahapan penilaian, memberikan klarifikasi, dan menerima verifikasi.</w:t>
       </w:r>
     </w:p>
     <w:p>
@@ -20645,7 +20660,7 @@
           <w:sz w:val="22"/>
           <w:szCs w:val="22"/>
         </w:rPr>
-        <w:t xml:space="preserve">Kami memberikan izin non-eksklusif kepada penyelenggara untuk mempublikasikan ringkasan, foto, dan video untuk kepentingan promosi dan pembelajaran inovasi daerah dengan mencantumkan nama inovator.</w:t>
+        <w:t xml:space="preserve">Saya/kami memberikan izin non-eksklusif kepada penyelenggara untuk mempublikasikan ringkasan, foto, dan video untuk kepentingan promosi dan pembelajaran inovasi daerah dengan mencantumkan nama inovator.</w:t>
       </w:r>
     </w:p>
     <w:p>
@@ -20664,371 +20679,65 @@
           <w:sz w:val="22"/>
           <w:szCs w:val="22"/>
         </w:rPr>
-        <w:t xml:space="preserve">Kami bersedia menerima diskualifikasi atau pencabutan penghargaan apabila pernyataan ini terbukti tidak benar.</w:t>
-      </w:r>
-    </w:p>
-    <w:tbl>
-      <w:tblPr>
-        <w:tblW w:type="dxa" w:w="8787"/>
-        <w:tblBorders>
-          <w:top w:val="single" w:color="auto" w:sz="4"/>
-          <w:left w:val="single" w:color="auto" w:sz="4"/>
-          <w:bottom w:val="single" w:color="auto" w:sz="4"/>
-          <w:right w:val="single" w:color="auto" w:sz="4"/>
-          <w:insideH w:val="single" w:color="auto" w:sz="4"/>
-          <w:insideV w:val="single" w:color="auto" w:sz="4"/>
-        </w:tblBorders>
-      </w:tblPr>
-      <w:tblGrid>
-        <w:gridCol w:w="2460"/>
-        <w:gridCol w:w="250"/>
-        <w:gridCol w:w="6077"/>
-      </w:tblGrid>
-      <w:tr>
-        <w:tc>
-          <w:tcPr>
-            <w:tcW w:type="dxa" w:w="2460"/>
-            <w:tcBorders>
-              <w:top w:val="none" w:color="FFFFFF" w:sz="0"/>
-              <w:left w:val="none" w:color="FFFFFF" w:sz="0"/>
-              <w:bottom w:val="none" w:color="FFFFFF" w:sz="0"/>
-              <w:right w:val="none" w:color="FFFFFF" w:sz="0"/>
-            </w:tcBorders>
-            <w:tcMar>
-              <w:top w:type="dxa" w:w="40"/>
-              <w:left w:type="dxa" w:w="90"/>
-              <w:bottom w:type="dxa" w:w="40"/>
-              <w:right w:type="dxa" w:w="90"/>
-            </w:tcMar>
-            <w:vAlign w:val="top"/>
-          </w:tcPr>
-          <w:p>
-            <w:pPr>
-              <w:spacing w:after="0" w:line="240" w:lineRule="auto"/>
-              <w:jc w:val="left"/>
-            </w:pPr>
-            <w:r>
-              <w:rPr>
-                <w:rFonts w:ascii="Arial" w:cs="Arial" w:eastAsia="Arial" w:hAnsi="Arial"/>
-                <w:sz w:val="22"/>
-                <w:szCs w:val="22"/>
-              </w:rPr>
-              <w:t xml:space="preserve">Dibuat di</w:t>
-            </w:r>
-          </w:p>
-        </w:tc>
-        <w:tc>
-          <w:tcPr>
-            <w:tcW w:type="dxa" w:w="250"/>
-            <w:tcBorders>
-              <w:top w:val="none" w:color="FFFFFF" w:sz="0"/>
-              <w:left w:val="none" w:color="FFFFFF" w:sz="0"/>
-              <w:bottom w:val="none" w:color="FFFFFF" w:sz="0"/>
-              <w:right w:val="none" w:color="FFFFFF" w:sz="0"/>
-            </w:tcBorders>
-            <w:tcMar>
-              <w:top w:type="dxa" w:w="40"/>
-              <w:left w:type="dxa" w:w="90"/>
-              <w:bottom w:type="dxa" w:w="40"/>
-              <w:right w:type="dxa" w:w="90"/>
-            </w:tcMar>
-            <w:vAlign w:val="top"/>
-          </w:tcPr>
-          <w:p>
-            <w:pPr>
-              <w:spacing w:after="0" w:line="240" w:lineRule="auto"/>
-              <w:jc w:val="left"/>
-            </w:pPr>
-            <w:r>
-              <w:rPr>
-                <w:rFonts w:ascii="Arial" w:cs="Arial" w:eastAsia="Arial" w:hAnsi="Arial"/>
-                <w:sz w:val="22"/>
-                <w:szCs w:val="22"/>
-              </w:rPr>
-              <w:t xml:space="preserve">:</w:t>
-            </w:r>
-          </w:p>
-        </w:tc>
-        <w:tc>
-          <w:tcPr>
-            <w:tcW w:type="dxa" w:w="6077"/>
-            <w:tcBorders>
-              <w:top w:val="none" w:color="FFFFFF" w:sz="0"/>
-              <w:left w:val="none" w:color="FFFFFF" w:sz="0"/>
-              <w:bottom w:val="none" w:color="FFFFFF" w:sz="0"/>
-              <w:right w:val="none" w:color="FFFFFF" w:sz="0"/>
-            </w:tcBorders>
-            <w:tcMar>
-              <w:top w:type="dxa" w:w="40"/>
-              <w:left w:type="dxa" w:w="90"/>
-              <w:bottom w:type="dxa" w:w="40"/>
-              <w:right w:type="dxa" w:w="90"/>
-            </w:tcMar>
-            <w:vAlign w:val="top"/>
-          </w:tcPr>
-          <w:p>
-            <w:pPr>
-              <w:spacing w:after="0" w:line="240" w:lineRule="auto"/>
-              <w:jc w:val="left"/>
-            </w:pPr>
-            <w:r>
-              <w:rPr>
-                <w:rFonts w:ascii="Arial" w:cs="Arial" w:eastAsia="Arial" w:hAnsi="Arial"/>
-                <w:sz w:val="22"/>
-                <w:szCs w:val="22"/>
-              </w:rPr>
-              <w:t xml:space="preserve">Tarakan</w:t>
-            </w:r>
-          </w:p>
-        </w:tc>
-      </w:tr>
-      <w:tr>
-        <w:tc>
-          <w:tcPr>
-            <w:tcW w:type="dxa" w:w="2460"/>
-            <w:tcBorders>
-              <w:top w:val="none" w:color="FFFFFF" w:sz="0"/>
-              <w:left w:val="none" w:color="FFFFFF" w:sz="0"/>
-              <w:bottom w:val="none" w:color="FFFFFF" w:sz="0"/>
-              <w:right w:val="none" w:color="FFFFFF" w:sz="0"/>
-            </w:tcBorders>
-            <w:tcMar>
-              <w:top w:type="dxa" w:w="40"/>
-              <w:left w:type="dxa" w:w="90"/>
-              <w:bottom w:type="dxa" w:w="40"/>
-              <w:right w:type="dxa" w:w="90"/>
-            </w:tcMar>
-            <w:vAlign w:val="top"/>
-          </w:tcPr>
-          <w:p>
-            <w:pPr>
-              <w:spacing w:after="0" w:line="240" w:lineRule="auto"/>
-              <w:jc w:val="left"/>
-            </w:pPr>
-            <w:r>
-              <w:rPr>
-                <w:rFonts w:ascii="Arial" w:cs="Arial" w:eastAsia="Arial" w:hAnsi="Arial"/>
-                <w:sz w:val="22"/>
-                <w:szCs w:val="22"/>
-              </w:rPr>
-              <w:t xml:space="preserve">Tanggal</w:t>
-            </w:r>
-          </w:p>
-        </w:tc>
-        <w:tc>
-          <w:tcPr>
-            <w:tcW w:type="dxa" w:w="250"/>
-            <w:tcBorders>
-              <w:top w:val="none" w:color="FFFFFF" w:sz="0"/>
-              <w:left w:val="none" w:color="FFFFFF" w:sz="0"/>
-              <w:bottom w:val="none" w:color="FFFFFF" w:sz="0"/>
-              <w:right w:val="none" w:color="FFFFFF" w:sz="0"/>
-            </w:tcBorders>
-            <w:tcMar>
-              <w:top w:type="dxa" w:w="40"/>
-              <w:left w:type="dxa" w:w="90"/>
-              <w:bottom w:type="dxa" w:w="40"/>
-              <w:right w:type="dxa" w:w="90"/>
-            </w:tcMar>
-            <w:vAlign w:val="top"/>
-          </w:tcPr>
-          <w:p>
-            <w:pPr>
-              <w:spacing w:after="0" w:line="240" w:lineRule="auto"/>
-              <w:jc w:val="left"/>
-            </w:pPr>
-            <w:r>
-              <w:rPr>
-                <w:rFonts w:ascii="Arial" w:cs="Arial" w:eastAsia="Arial" w:hAnsi="Arial"/>
-                <w:sz w:val="22"/>
-                <w:szCs w:val="22"/>
-              </w:rPr>
-              <w:t xml:space="preserve">:</w:t>
-            </w:r>
-          </w:p>
-        </w:tc>
-        <w:tc>
-          <w:tcPr>
-            <w:tcW w:type="dxa" w:w="6077"/>
-            <w:tcBorders>
-              <w:top w:val="none" w:color="FFFFFF" w:sz="0"/>
-              <w:left w:val="none" w:color="FFFFFF" w:sz="0"/>
-              <w:bottom w:val="none" w:color="FFFFFF" w:sz="0"/>
-              <w:right w:val="none" w:color="FFFFFF" w:sz="0"/>
-            </w:tcBorders>
-            <w:tcMar>
-              <w:top w:type="dxa" w:w="40"/>
-              <w:left w:type="dxa" w:w="90"/>
-              <w:bottom w:type="dxa" w:w="40"/>
-              <w:right w:type="dxa" w:w="90"/>
-            </w:tcMar>
-            <w:vAlign w:val="top"/>
-          </w:tcPr>
-          <w:p>
-            <w:pPr>
-              <w:spacing w:after="0" w:line="240" w:lineRule="auto"/>
-              <w:jc w:val="left"/>
-            </w:pPr>
-            <w:r>
-              <w:rPr>
-                <w:rFonts w:ascii="Arial" w:cs="Arial" w:eastAsia="Arial" w:hAnsi="Arial"/>
-                <w:sz w:val="22"/>
-                <w:szCs w:val="22"/>
-              </w:rPr>
-              <w:t xml:space="preserve">........ Oktober 2026</w:t>
-            </w:r>
-          </w:p>
-        </w:tc>
-      </w:tr>
-    </w:tbl>
-    <w:p>
-      <w:pPr>
-        <w:spacing w:after="0"/>
-      </w:pPr>
-    </w:p>
-    <w:tbl>
-      <w:tblPr>
-        <w:tblW w:type="dxa" w:w="8787"/>
-        <w:tblBorders>
-          <w:top w:val="single" w:color="auto" w:sz="4"/>
-          <w:left w:val="single" w:color="auto" w:sz="4"/>
-          <w:bottom w:val="single" w:color="auto" w:sz="4"/>
-          <w:right w:val="single" w:color="auto" w:sz="4"/>
-          <w:insideH w:val="single" w:color="auto" w:sz="4"/>
-          <w:insideV w:val="single" w:color="auto" w:sz="4"/>
-        </w:tblBorders>
-      </w:tblPr>
-      <w:tblGrid>
-        <w:gridCol w:w="4394"/>
-        <w:gridCol w:w="4393"/>
-      </w:tblGrid>
-      <w:tr>
-        <w:tc>
-          <w:tcPr>
-            <w:tcW w:type="dxa" w:w="4394"/>
-            <w:tcBorders>
-              <w:top w:val="none" w:color="FFFFFF" w:sz="0"/>
-              <w:left w:val="none" w:color="FFFFFF" w:sz="0"/>
-              <w:bottom w:val="none" w:color="FFFFFF" w:sz="0"/>
-              <w:right w:val="none" w:color="FFFFFF" w:sz="0"/>
-            </w:tcBorders>
-            <w:tcMar>
-              <w:top w:type="dxa" w:w="40"/>
-              <w:left w:type="dxa" w:w="90"/>
-              <w:bottom w:type="dxa" w:w="40"/>
-              <w:right w:type="dxa" w:w="90"/>
-            </w:tcMar>
-            <w:vAlign w:val="top"/>
-          </w:tcPr>
-          <w:p>
-            <w:pPr>
-              <w:spacing w:after="0" w:line="240" w:lineRule="auto"/>
-              <w:jc w:val="left"/>
-            </w:pPr>
-          </w:p>
-        </w:tc>
-        <w:tc>
-          <w:tcPr>
-            <w:tcW w:type="dxa" w:w="4393"/>
-            <w:tcBorders>
-              <w:top w:val="none" w:color="FFFFFF" w:sz="0"/>
-              <w:left w:val="none" w:color="FFFFFF" w:sz="0"/>
-              <w:bottom w:val="none" w:color="FFFFFF" w:sz="0"/>
-              <w:right w:val="none" w:color="FFFFFF" w:sz="0"/>
-            </w:tcBorders>
-            <w:tcMar>
-              <w:top w:type="dxa" w:w="40"/>
-              <w:left w:type="dxa" w:w="90"/>
-              <w:bottom w:type="dxa" w:w="40"/>
-              <w:right w:type="dxa" w:w="90"/>
-            </w:tcMar>
-            <w:vAlign w:val="top"/>
-          </w:tcPr>
-          <w:p>
-            <w:pPr>
-              <w:spacing w:after="0" w:line="240" w:lineRule="auto"/>
-              <w:jc w:val="left"/>
-            </w:pPr>
-            <w:r>
-              <w:rPr>
-                <w:rFonts w:ascii="Arial" w:cs="Arial" w:eastAsia="Arial" w:hAnsi="Arial"/>
-                <w:sz w:val="22"/>
-                <w:szCs w:val="22"/>
-              </w:rPr>
-              <w:t xml:space="preserve">Yang membuat pernyataan,</w:t>
-            </w:r>
-          </w:p>
-          <w:p>
-            <w:pPr>
-              <w:spacing w:after="0" w:line="240" w:lineRule="auto"/>
-              <w:jc w:val="left"/>
-            </w:pPr>
-            <w:r>
-              <w:rPr>
-                <w:rFonts w:ascii="Arial" w:cs="Arial" w:eastAsia="Arial" w:hAnsi="Arial"/>
-                <w:sz w:val="22"/>
-                <w:szCs w:val="22"/>
-              </w:rPr>
-              <w:t xml:space="preserve">Ketua Tim Inovasi Prokopim Hibot,</w:t>
-            </w:r>
-          </w:p>
-          <w:p>
-            <w:pPr>
-              <w:spacing w:after="0" w:line="240" w:lineRule="auto"/>
-              <w:jc w:val="left"/>
-            </w:pPr>
-          </w:p>
-          <w:p>
-            <w:pPr>
-              <w:spacing w:after="0" w:line="240" w:lineRule="auto"/>
-              <w:jc w:val="left"/>
-            </w:pPr>
-          </w:p>
-          <w:p>
-            <w:pPr>
-              <w:spacing w:after="0" w:line="240" w:lineRule="auto"/>
-              <w:jc w:val="left"/>
-            </w:pPr>
-          </w:p>
-          <w:p>
-            <w:pPr>
-              <w:spacing w:after="0" w:line="240" w:lineRule="auto"/>
-              <w:jc w:val="left"/>
-            </w:pPr>
-          </w:p>
-          <w:p>
-            <w:pPr>
-              <w:spacing w:after="0" w:line="240" w:lineRule="auto"/>
-              <w:jc w:val="left"/>
-            </w:pPr>
-            <w:r>
-              <w:rPr>
-                <w:rFonts w:ascii="Arial" w:cs="Arial" w:eastAsia="Arial" w:hAnsi="Arial"/>
-                <w:b/>
-                <w:bCs/>
-                <w:sz w:val="22"/>
-                <w:szCs w:val="22"/>
-              </w:rPr>
-              <w:t xml:space="preserve">Anugrah Yega Pranatha, M.Si.</w:t>
-            </w:r>
-          </w:p>
-          <w:p>
-            <w:pPr>
-              <w:spacing w:after="0" w:line="240" w:lineRule="auto"/>
-              <w:jc w:val="left"/>
-            </w:pPr>
-            <w:r>
-              <w:rPr>
-                <w:rFonts w:ascii="Arial" w:cs="Arial" w:eastAsia="Arial" w:hAnsi="Arial"/>
-                <w:sz w:val="22"/>
-                <w:szCs w:val="22"/>
-              </w:rPr>
-              <w:t xml:space="preserve">NIP 198811032007011003</w:t>
-            </w:r>
-          </w:p>
-        </w:tc>
-      </w:tr>
-    </w:tbl>
+        <w:t xml:space="preserve">Saya/kami bersedia menerima diskualifikasi atau pencabutan penghargaan apabila pernyataan ini terbukti tidak benar.</w:t>
+      </w:r>
+    </w:p>
+    <w:p>
+      <w:pPr>
+        <w:spacing w:after="0" w:before="240" w:line="276" w:lineRule="auto"/>
+        <w:jc w:val="both"/>
+      </w:pPr>
+      <w:r>
+        <w:rPr>
+          <w:rFonts w:ascii="Arial" w:cs="Arial" w:eastAsia="Arial" w:hAnsi="Arial"/>
+          <w:sz w:val="22"/>
+          <w:szCs w:val="22"/>
+        </w:rPr>
+        <w:t xml:space="preserve">Dibuat di : Tarakan</w:t>
+      </w:r>
+    </w:p>
+    <w:p>
+      <w:pPr>
+        <w:spacing w:after="240" w:before="0" w:line="276" w:lineRule="auto"/>
+        <w:jc w:val="both"/>
+      </w:pPr>
+      <w:r>
+        <w:rPr>
+          <w:rFonts w:ascii="Arial" w:cs="Arial" w:eastAsia="Arial" w:hAnsi="Arial"/>
+          <w:sz w:val="22"/>
+          <w:szCs w:val="22"/>
+        </w:rPr>
+        <w:t xml:space="preserve">Tanggal : ........ Oktober 2026</w:t>
+      </w:r>
+    </w:p>
+    <w:p>
+      <w:pPr>
+        <w:spacing w:after="1300" w:before="0" w:line="276" w:lineRule="auto"/>
+        <w:jc w:val="both"/>
+      </w:pPr>
+      <w:r>
+        <w:rPr>
+          <w:rFonts w:ascii="Arial" w:cs="Arial" w:eastAsia="Arial" w:hAnsi="Arial"/>
+          <w:sz w:val="22"/>
+          <w:szCs w:val="22"/>
+        </w:rPr>
+        <w:t xml:space="preserve">Yang membuat pernyataan,</w:t>
+      </w:r>
+    </w:p>
+    <w:p>
+      <w:pPr>
+        <w:spacing w:after="100" w:before="0" w:line="276" w:lineRule="auto"/>
+        <w:jc w:val="both"/>
+      </w:pPr>
+      <w:r>
+        <w:rPr>
+          <w:rFonts w:ascii="Arial" w:cs="Arial" w:eastAsia="Arial" w:hAnsi="Arial"/>
+          <w:sz w:val="22"/>
+          <w:szCs w:val="22"/>
+        </w:rPr>
+        <w:t xml:space="preserve">(Anugrah Yega Pranatha, M.Si.)</w:t>
+      </w:r>
+    </w:p>
     <w:p>
       <w:r>
         <w:br w:type="page"/>

</xml_diff>